<commit_message>
Paper C MSJ round 5: abstract with four key results, split dense passages, restated H4, p-value convention explained, universal negatives removed, Vietnamese studies added, equations in two-cell tables, Unicode inline symbols
Co-Authored-By: Claude Opus 5.5 <noreply@anthropic.com>
Claude-Session: https://claude.ai/code/session_011zPDaCYE4jmmpoRvPu4SUX
</commit_message>
<xml_diff>
--- a/paper2/manuscript/msj/manuscript_msj.docx
+++ b/paper2/manuscript/msj/manuscript_msj.docx
@@ -7,7 +7,7 @@
         <w:pStyle w:val="FirstParagraph"/>
       </w:pPr>
       <w:r>
-        <w:t xml:space="preserve">[[ABSTRACT]] Daily price limits aim to cool markets but can delay price discovery. Few studies trace prices after limit closes in emerging markets, and among the studies identified by our search, none tests the limit against other candidate signals. For 347 stocks on the Ho Chi Minh Stock Exchange from August 2024 to September 2026, we run 26 tests under false discovery rate control: four price limit event tests and 22 price- and volume-based characteristics. About 2.0% of stock-days close at the upper limit and 1.4% at the lower limit. We split the next-day abnormal return into an overnight gap and an intraday return and compare limit closes with stocks that moved almost as far. All four limit tests survived; none of the 22 lower-powered characteristic tests survived. After a ceiling close, the next-day abnormal return of 1.7% is an overnight gap of 2.2% less an intraday reversal of 0.5%, and the gap exceeds that after rises of 5% to 6.5% by 2.7 percentage points, and by 3.1 points when those stocks also closed at their daily high. After a floor close the overnight gap is −1.0%, and the size of the floor effect depends on the benchmark. The ceiling gap is positive and significant in each of the 8 calendar quarters and is present before the move of the exchange to a new trading platform in May 2025. A buyer at the next opening loses 0.7% against the market by the fifth closing. The pattern is consistent with delayed price discovery, but also with news, attention, and opening-auction overshooting; without news or order-book data, we cannot separate them. Most of the next-day effect arises in the opening auction, linking price-limit design to auction design.</w:t>
+        <w:t xml:space="preserve">[[ABSTRACT]] Daily price limits are meant to cool markets, but they may also delay price discovery. We examine what happens after a stock closes at its daily limit on the Ho Chi Minh Stock Exchange, a market dominated by individual investors that applies one 7% band and sets opening and closing prices by call auction. Using daily prices for 347 stocks from August 2024 to September 2026, we split the next-day abnormal return after limit closes into an overnight gap and an intraday return. We compare limit closes with stocks that rose or fell almost as far, and we test the limit effect together with a broad set of price- and volume-based characteristics under false discovery rate control. The limit tests survive this control, whereas none of the characteristics does. After a ceiling close, the stock opens on average 2.2% above the market, and the following session gives back about 24% of this gap. The gap is 2.7 percentage points larger than after rises that stop short of the limit, and the difference remains when those stocks also closed at their daily high. An investor who buys at the next opening cannot capture the effect and loses 0.7% against the market by the fifth close. Floor closes are followed by a negative gap whose size depends on the benchmark. The ceiling gap appears in every calendar quarter and before the exchange changed its trading platform in 2025. The pattern is consistent with delayed price discovery, but news, investor attention, and auction overshooting may also contribute, and data on news and order books are needed to separate them. For market design, the results suggest that the opening auction absorbs much of the price adjustment that the 7% band postpones.</w:t>
       </w:r>
     </w:p>
     <w:p>
@@ -40,7 +40,7 @@
         <w:pStyle w:val="BodyText"/>
       </w:pPr>
       <w:r>
-        <w:t xml:space="preserve">Studies on band changes have documented the effects on volatility, liquidity, and crash risk (Jia et al., 2024; Lien et al., 2019; Qi, 2023), and account-level data have shown that large investors buy on the limit day and sell on the next (Chen et al., 2019). Among the studies identified by the search described in Supplementary Material S1, only Huang et al. (2001) described the overnight-then-intraday pattern after limit hits, and the records we could access had no magnitudes. None measures the overnight gap and intraday return after a limit close against a benchmark, places the limit result in a family of tests that controls for other price-based signals a researcher could have examined, or examines the 2025 move of the HOSE to a new trading platform.</w:t>
+        <w:t xml:space="preserve">Studies on band changes have documented effects on volatility, liquidity, and crash risk (Jia et al., 2024; Lien et al., 2019; Qi, 2023), and account-level data have shown that large investors buy on the limit day and sell on the next (Chen et al., 2019). For Vietnam, Le (2018) evaluated how narrower bands after 2008 affected stock price risk, and Farber et al. (2006) documented clusters and sequences of limit hits in the early years of the market. Huang et al. (2001) reported for Taiwan that the overnight overreaction after limit hits reverses on the following day. Less is known about three questions. How large are the overnight gap and the intraday reversal after a limit close relative to a benchmark? Does the limit effect remain once the many other price-based signals that a researcher could test are taken into account? How does the pattern behave around the 2025 move of the HOSE to a new trading platform?</w:t>
       </w:r>
     </w:p>
     <w:p>
@@ -168,7 +168,7 @@
         <w:t xml:space="preserve">t</w:t>
       </w:r>
       <w:r>
-        <w:t xml:space="preserve">-statistic above 3.0, Harvey and Liu (2020) tied the hurdle to a chosen FDR, Chordia et al. (2020) put multiple-testing thresholds for cross-sectional regressions near 3.4, and Hou et al. (2020) found that with microcaps mitigated, 65% of 452 anomalies fail the single-test hurdle of 1.96. Petersen (2009) compared standard-error estimators for panel data, which motivates our alternative clusters, and Gutierrez and Kelley (2008) studied weekly returns, the frequency of our regressions. For Vietnam, Huang et al. (2023) found a size effect and an earnings-to-price effect; our search (Supplementary Material S1) identified no peer-reviewed study of post-limit returns on the HOSE.</w:t>
+        <w:t xml:space="preserve">-statistic above 3.0, and Harvey and Liu (2020) tied the hurdle to a chosen FDR. Chordia et al. (2020) put multiple-testing thresholds for cross-sectional regressions near 3.4, and Hou et al. (2020) found that with microcaps mitigated, 65% of 452 anomalies fail the single-test hurdle of 1.96. Petersen (2009) compared standard-error estimators for panel data, which motivates our alternative clusters, and Gutierrez and Kelley (2008) studied weekly returns, the frequency of our regressions. For Vietnam, Huang et al. (2023) found a size effect and an earnings-to-price effect.</w:t>
       </w:r>
     </w:p>
     <w:p>
@@ -186,7 +186,7 @@
         <w:t xml:space="preserve"> </w:t>
       </w:r>
       <w:r>
-        <w:t xml:space="preserve">These studies compared band regimes, sorted stocks by limit exposure, or split overnight and intraday returns for all stocks. Among the studies our search identified, only Huang et al. (2001) linked limit hits to the overnight-intraday split, and none controlled for multiple testing or used the 2025 platform change. If a limit delays price discovery, a ceiling close predicts a positive next-day abnormal return, and a floor close predicts a negative one (H</w:t>
+        <w:t xml:space="preserve">These studies compared band regimes, sorted stocks by limit exposure, or split overnight and intraday returns for all stocks. Huang et al. (2001) linked limit hits to the overnight-intraday timing in Taiwan. The present study measures this split against benchmarks on the HOSE, places the limit tests in a family that controls for multiple testing, and uses the 2025 platform change. If a limit delays price discovery, a ceiling close predicts a positive next-day abnormal return, and a floor close predicts a negative one (H</w:t>
       </w:r>
       <w:r>
         <w:rPr>
@@ -213,7 +213,7 @@
         <w:t xml:space="preserve">3</w:t>
       </w:r>
       <w:r>
-        <w:t xml:space="preserve">). An investor who buys at the next open earns no positive abnormal returns through the fifth trading day (H</w:t>
+        <w:t xml:space="preserve">). If the gap already contains the blocked demand, an investor who buys at the next open cannot earn the continuation; the abnormal return from the next open to the fifth close is then zero or negative (H</w:t>
       </w:r>
       <w:r>
         <w:rPr>
@@ -329,11 +329,13 @@
       <w:r>
         <w:t xml:space="preserve"> </w:t>
       </w:r>
-      <m:oMath>
-        <m:r>
-          <m:t>i</m:t>
-        </m:r>
-      </m:oMath>
+      <w:r>
+        <w:rPr>
+          <w:iCs/>
+          <w:i/>
+        </w:rPr>
+        <w:t xml:space="preserve">i</w:t>
+      </w:r>
       <w:r>
         <w:t xml:space="preserve"> </w:t>
       </w:r>
@@ -343,127 +345,153 @@
       <w:r>
         <w:t xml:space="preserve"> </w:t>
       </w:r>
-      <m:oMath>
-        <m:r>
-          <m:t>d</m:t>
-        </m:r>
-      </m:oMath>
+      <w:r>
+        <w:rPr>
+          <w:iCs/>
+          <w:i/>
+        </w:rPr>
+        <w:t xml:space="preserve">d</w:t>
+      </w:r>
       <w:r>
         <w:t xml:space="preserve">,</w:t>
       </w:r>
       <w:r>
         <w:t xml:space="preserve"> </w:t>
       </w:r>
-      <m:oMath>
-        <m:sSub>
-          <m:e>
-            <m:r>
-              <m:t>C</m:t>
-            </m:r>
-          </m:e>
-          <m:sub>
-            <m:r>
-              <m:t>i</m:t>
-            </m:r>
-            <m:r>
-              <m:rPr>
-                <m:sty m:val="p"/>
-              </m:rPr>
-              <m:t>,</m:t>
-            </m:r>
-            <m:r>
-              <m:t>d</m:t>
-            </m:r>
-          </m:sub>
-        </m:sSub>
-      </m:oMath>
-      <w:r>
+      <w:r>
+        <w:rPr>
+          <w:iCs/>
+          <w:i/>
+        </w:rPr>
+        <w:t xml:space="preserve">C</w:t>
+      </w:r>
+      <w:r>
+        <w:rPr>
+          <w:iCs/>
+          <w:i/>
+          <w:vertAlign w:val="subscript"/>
+        </w:rPr>
+        <w:t xml:space="preserve">i</w:t>
+      </w:r>
+      <w:r>
+        <w:rPr>
+          <w:vertAlign w:val="subscript"/>
+        </w:rPr>
         <w:t xml:space="preserve">,</w:t>
       </w:r>
       <w:r>
-        <w:t xml:space="preserve"> </w:t>
-      </w:r>
-      <m:oMath>
-        <m:sSub>
-          <m:e>
-            <m:r>
-              <m:t>O</m:t>
-            </m:r>
-          </m:e>
-          <m:sub>
-            <m:r>
-              <m:t>i</m:t>
-            </m:r>
-            <m:r>
-              <m:rPr>
-                <m:sty m:val="p"/>
-              </m:rPr>
-              <m:t>,</m:t>
-            </m:r>
-            <m:r>
-              <m:t>d</m:t>
-            </m:r>
-          </m:sub>
-        </m:sSub>
-      </m:oMath>
+        <w:rPr>
+          <w:iCs/>
+          <w:i/>
+          <w:vertAlign w:val="subscript"/>
+        </w:rPr>
+        <w:t xml:space="preserve">d</w:t>
+      </w:r>
       <w:r>
         <w:t xml:space="preserve">,</w:t>
       </w:r>
       <w:r>
         <w:t xml:space="preserve"> </w:t>
       </w:r>
-      <m:oMath>
-        <m:sSub>
-          <m:e>
-            <m:r>
-              <m:t>H</m:t>
-            </m:r>
-          </m:e>
-          <m:sub>
-            <m:r>
-              <m:t>i</m:t>
-            </m:r>
-            <m:r>
-              <m:rPr>
-                <m:sty m:val="p"/>
-              </m:rPr>
-              <m:t>,</m:t>
-            </m:r>
-            <m:r>
-              <m:t>d</m:t>
-            </m:r>
-          </m:sub>
-        </m:sSub>
-      </m:oMath>
+      <w:r>
+        <w:rPr>
+          <w:iCs/>
+          <w:i/>
+        </w:rPr>
+        <w:t xml:space="preserve">O</w:t>
+      </w:r>
+      <w:r>
+        <w:rPr>
+          <w:iCs/>
+          <w:i/>
+          <w:vertAlign w:val="subscript"/>
+        </w:rPr>
+        <w:t xml:space="preserve">i</w:t>
+      </w:r>
+      <w:r>
+        <w:rPr>
+          <w:vertAlign w:val="subscript"/>
+        </w:rPr>
+        <w:t xml:space="preserve">,</w:t>
+      </w:r>
+      <w:r>
+        <w:rPr>
+          <w:iCs/>
+          <w:i/>
+          <w:vertAlign w:val="subscript"/>
+        </w:rPr>
+        <w:t xml:space="preserve">d</w:t>
+      </w:r>
+      <w:r>
+        <w:t xml:space="preserve">,</w:t>
+      </w:r>
+      <w:r>
+        <w:t xml:space="preserve"> </w:t>
+      </w:r>
+      <w:r>
+        <w:rPr>
+          <w:iCs/>
+          <w:i/>
+        </w:rPr>
+        <w:t xml:space="preserve">H</w:t>
+      </w:r>
+      <w:r>
+        <w:rPr>
+          <w:iCs/>
+          <w:i/>
+          <w:vertAlign w:val="subscript"/>
+        </w:rPr>
+        <w:t xml:space="preserve">i</w:t>
+      </w:r>
+      <w:r>
+        <w:rPr>
+          <w:vertAlign w:val="subscript"/>
+        </w:rPr>
+        <w:t xml:space="preserve">,</w:t>
+      </w:r>
+      <w:r>
+        <w:rPr>
+          <w:iCs/>
+          <w:i/>
+          <w:vertAlign w:val="subscript"/>
+        </w:rPr>
+        <w:t xml:space="preserve">d</w:t>
+      </w:r>
       <w:r>
         <w:t xml:space="preserve">, and</w:t>
       </w:r>
       <w:r>
         <w:t xml:space="preserve"> </w:t>
       </w:r>
-      <m:oMath>
-        <m:sSub>
-          <m:e>
-            <m:r>
-              <m:t>L</m:t>
-            </m:r>
-          </m:e>
-          <m:sub>
-            <m:r>
-              <m:t>i</m:t>
-            </m:r>
-            <m:r>
-              <m:rPr>
-                <m:sty m:val="p"/>
-              </m:rPr>
-              <m:t>,</m:t>
-            </m:r>
-            <m:r>
-              <m:t>d</m:t>
-            </m:r>
-          </m:sub>
-        </m:sSub>
-      </m:oMath>
+      <w:r>
+        <w:rPr>
+          <w:iCs/>
+          <w:i/>
+        </w:rPr>
+        <w:t xml:space="preserve">L</w:t>
+      </w:r>
+      <w:r>
+        <w:rPr>
+          <w:iCs/>
+          <w:i/>
+          <w:vertAlign w:val="subscript"/>
+        </w:rPr>
+        <w:t xml:space="preserve">i</w:t>
+      </w:r>
+      <w:r>
+        <w:rPr>
+          <w:vertAlign w:val="subscript"/>
+        </w:rPr>
+        <w:t xml:space="preserve">,</w:t>
+      </w:r>
+      <w:r>
+        <w:rPr>
+          <w:iCs/>
+          <w:i/>
+          <w:vertAlign w:val="subscript"/>
+        </w:rPr>
+        <w:t xml:space="preserve">d</w:t>
+      </w:r>
       <w:r>
         <w:t xml:space="preserve"> </w:t>
       </w:r>
@@ -582,16 +610,6 @@
             </m:rPr>
             <m:t>.</m:t>
           </m:r>
-          <m:r>
-            <m:t>  </m:t>
-          </m:r>
-          <m:r>
-            <m:rPr>
-              <m:nor/>
-              <m:sty m:val="p"/>
-            </m:rPr>
-            <m:t>(1)</m:t>
-          </m:r>
         </m:oMath>
       </m:oMathPara>
     </w:p>
@@ -600,205 +618,235 @@
         <w:pStyle w:val="FirstParagraph"/>
       </w:pPr>
       <w:r>
+        <w:t xml:space="preserve">[[EQNUM:1]]</w:t>
+      </w:r>
+    </w:p>
+    <w:p>
+      <w:pPr>
+        <w:pStyle w:val="BodyText"/>
+      </w:pPr>
+      <w:r>
         <w:t xml:space="preserve">A ceiling event has a return (Equation (1)) of</w:t>
       </w:r>
       <w:r>
         <w:t xml:space="preserve"> </w:t>
       </w:r>
-      <m:oMath>
-        <m:sSub>
-          <m:e>
-            <m:r>
-              <m:t>R</m:t>
-            </m:r>
-          </m:e>
-          <m:sub>
-            <m:r>
-              <m:t>i</m:t>
-            </m:r>
-            <m:r>
-              <m:rPr>
-                <m:sty m:val="p"/>
-              </m:rPr>
-              <m:t>,</m:t>
-            </m:r>
-            <m:r>
-              <m:t>d</m:t>
-            </m:r>
-          </m:sub>
-        </m:sSub>
-        <m:r>
-          <m:rPr>
-            <m:sty m:val="p"/>
-          </m:rPr>
-          <m:t>≥</m:t>
-        </m:r>
-        <m:r>
-          <m:t>0.065</m:t>
-        </m:r>
-      </m:oMath>
-      <w:r>
-        <w:t xml:space="preserve"> </w:t>
-      </w:r>
-      <w:r>
-        <w:t xml:space="preserve">and</w:t>
-      </w:r>
-      <w:r>
-        <w:t xml:space="preserve"> </w:t>
-      </w:r>
-      <m:oMath>
-        <m:sSub>
-          <m:e>
-            <m:r>
-              <m:t>C</m:t>
-            </m:r>
-          </m:e>
-          <m:sub>
-            <m:r>
-              <m:t>i</m:t>
-            </m:r>
-            <m:r>
-              <m:rPr>
-                <m:sty m:val="p"/>
-              </m:rPr>
-              <m:t>,</m:t>
-            </m:r>
-            <m:r>
-              <m:t>d</m:t>
-            </m:r>
-          </m:sub>
-        </m:sSub>
-        <m:r>
-          <m:rPr>
-            <m:sty m:val="p"/>
-          </m:rPr>
-          <m:t>=</m:t>
-        </m:r>
-        <m:sSub>
-          <m:e>
-            <m:r>
-              <m:t>H</m:t>
-            </m:r>
-          </m:e>
-          <m:sub>
-            <m:r>
-              <m:t>i</m:t>
-            </m:r>
-            <m:r>
-              <m:rPr>
-                <m:sty m:val="p"/>
-              </m:rPr>
-              <m:t>,</m:t>
-            </m:r>
-            <m:r>
-              <m:t>d</m:t>
-            </m:r>
-          </m:sub>
-        </m:sSub>
-      </m:oMath>
+      <w:r>
+        <w:rPr>
+          <w:iCs/>
+          <w:i/>
+        </w:rPr>
+        <w:t xml:space="preserve">R</w:t>
+      </w:r>
+      <w:r>
+        <w:rPr>
+          <w:iCs/>
+          <w:i/>
+          <w:vertAlign w:val="subscript"/>
+        </w:rPr>
+        <w:t xml:space="preserve">i</w:t>
+      </w:r>
+      <w:r>
+        <w:rPr>
+          <w:vertAlign w:val="subscript"/>
+        </w:rPr>
+        <w:t xml:space="preserve">,</w:t>
+      </w:r>
+      <w:r>
+        <w:rPr>
+          <w:iCs/>
+          <w:i/>
+          <w:vertAlign w:val="subscript"/>
+        </w:rPr>
+        <w:t xml:space="preserve">d</w:t>
+      </w:r>
+      <w:r>
+        <w:t xml:space="preserve"> </w:t>
+      </w:r>
+      <w:r>
+        <w:t xml:space="preserve">≥ 0.065 and</w:t>
+      </w:r>
+      <w:r>
+        <w:t xml:space="preserve"> </w:t>
+      </w:r>
+      <w:r>
+        <w:rPr>
+          <w:iCs/>
+          <w:i/>
+        </w:rPr>
+        <w:t xml:space="preserve">C</w:t>
+      </w:r>
+      <w:r>
+        <w:rPr>
+          <w:iCs/>
+          <w:i/>
+          <w:vertAlign w:val="subscript"/>
+        </w:rPr>
+        <w:t xml:space="preserve">i</w:t>
+      </w:r>
+      <w:r>
+        <w:rPr>
+          <w:vertAlign w:val="subscript"/>
+        </w:rPr>
+        <w:t xml:space="preserve">,</w:t>
+      </w:r>
+      <w:r>
+        <w:rPr>
+          <w:iCs/>
+          <w:i/>
+          <w:vertAlign w:val="subscript"/>
+        </w:rPr>
+        <w:t xml:space="preserve">d</w:t>
+      </w:r>
+      <w:r>
+        <w:t xml:space="preserve"> </w:t>
+      </w:r>
+      <w:r>
+        <w:t xml:space="preserve">=</w:t>
+      </w:r>
+      <w:r>
+        <w:t xml:space="preserve"> </w:t>
+      </w:r>
+      <w:r>
+        <w:rPr>
+          <w:iCs/>
+          <w:i/>
+        </w:rPr>
+        <w:t xml:space="preserve">H</w:t>
+      </w:r>
+      <w:r>
+        <w:rPr>
+          <w:iCs/>
+          <w:i/>
+          <w:vertAlign w:val="subscript"/>
+        </w:rPr>
+        <w:t xml:space="preserve">i</w:t>
+      </w:r>
+      <w:r>
+        <w:rPr>
+          <w:vertAlign w:val="subscript"/>
+        </w:rPr>
+        <w:t xml:space="preserve">,</w:t>
+      </w:r>
+      <w:r>
+        <w:rPr>
+          <w:iCs/>
+          <w:i/>
+          <w:vertAlign w:val="subscript"/>
+        </w:rPr>
+        <w:t xml:space="preserve">d</w:t>
+      </w:r>
       <w:r>
         <w:t xml:space="preserve">, whereas a floor event has</w:t>
       </w:r>
       <w:r>
         <w:t xml:space="preserve"> </w:t>
       </w:r>
-      <m:oMath>
-        <m:sSub>
-          <m:e>
-            <m:r>
-              <m:t>R</m:t>
-            </m:r>
-          </m:e>
-          <m:sub>
-            <m:r>
-              <m:t>i</m:t>
-            </m:r>
-            <m:r>
-              <m:rPr>
-                <m:sty m:val="p"/>
-              </m:rPr>
-              <m:t>,</m:t>
-            </m:r>
-            <m:r>
-              <m:t>d</m:t>
-            </m:r>
-          </m:sub>
-        </m:sSub>
-        <m:r>
-          <m:rPr>
-            <m:sty m:val="p"/>
-          </m:rPr>
-          <m:t>≤</m:t>
-        </m:r>
-        <m:r>
-          <m:rPr>
-            <m:sty m:val="p"/>
-          </m:rPr>
-          <m:t>−</m:t>
-        </m:r>
-        <m:r>
-          <m:t>0.065</m:t>
-        </m:r>
-      </m:oMath>
-      <w:r>
-        <w:t xml:space="preserve"> </w:t>
-      </w:r>
-      <w:r>
-        <w:t xml:space="preserve">and</w:t>
-      </w:r>
-      <w:r>
-        <w:t xml:space="preserve"> </w:t>
-      </w:r>
-      <m:oMath>
-        <m:sSub>
-          <m:e>
-            <m:r>
-              <m:t>C</m:t>
-            </m:r>
-          </m:e>
-          <m:sub>
-            <m:r>
-              <m:t>i</m:t>
-            </m:r>
-            <m:r>
-              <m:rPr>
-                <m:sty m:val="p"/>
-              </m:rPr>
-              <m:t>,</m:t>
-            </m:r>
-            <m:r>
-              <m:t>d</m:t>
-            </m:r>
-          </m:sub>
-        </m:sSub>
-        <m:r>
-          <m:rPr>
-            <m:sty m:val="p"/>
-          </m:rPr>
-          <m:t>=</m:t>
-        </m:r>
-        <m:sSub>
-          <m:e>
-            <m:r>
-              <m:t>L</m:t>
-            </m:r>
-          </m:e>
-          <m:sub>
-            <m:r>
-              <m:t>i</m:t>
-            </m:r>
-            <m:r>
-              <m:rPr>
-                <m:sty m:val="p"/>
-              </m:rPr>
-              <m:t>,</m:t>
-            </m:r>
-            <m:r>
-              <m:t>d</m:t>
-            </m:r>
-          </m:sub>
-        </m:sSub>
-      </m:oMath>
+      <w:r>
+        <w:rPr>
+          <w:iCs/>
+          <w:i/>
+        </w:rPr>
+        <w:t xml:space="preserve">R</w:t>
+      </w:r>
+      <w:r>
+        <w:rPr>
+          <w:iCs/>
+          <w:i/>
+          <w:vertAlign w:val="subscript"/>
+        </w:rPr>
+        <w:t xml:space="preserve">i</w:t>
+      </w:r>
+      <w:r>
+        <w:rPr>
+          <w:vertAlign w:val="subscript"/>
+        </w:rPr>
+        <w:t xml:space="preserve">,</w:t>
+      </w:r>
+      <w:r>
+        <w:rPr>
+          <w:iCs/>
+          <w:i/>
+          <w:vertAlign w:val="subscript"/>
+        </w:rPr>
+        <w:t xml:space="preserve">d</w:t>
+      </w:r>
+      <w:r>
+        <w:t xml:space="preserve"> </w:t>
+      </w:r>
+      <w:r>
+        <w:t xml:space="preserve">≤ −0.065 and</w:t>
+      </w:r>
+      <w:r>
+        <w:t xml:space="preserve"> </w:t>
+      </w:r>
+      <w:r>
+        <w:rPr>
+          <w:iCs/>
+          <w:i/>
+        </w:rPr>
+        <w:t xml:space="preserve">C</w:t>
+      </w:r>
+      <w:r>
+        <w:rPr>
+          <w:iCs/>
+          <w:i/>
+          <w:vertAlign w:val="subscript"/>
+        </w:rPr>
+        <w:t xml:space="preserve">i</w:t>
+      </w:r>
+      <w:r>
+        <w:rPr>
+          <w:vertAlign w:val="subscript"/>
+        </w:rPr>
+        <w:t xml:space="preserve">,</w:t>
+      </w:r>
+      <w:r>
+        <w:rPr>
+          <w:iCs/>
+          <w:i/>
+          <w:vertAlign w:val="subscript"/>
+        </w:rPr>
+        <w:t xml:space="preserve">d</w:t>
+      </w:r>
+      <w:r>
+        <w:t xml:space="preserve"> </w:t>
+      </w:r>
+      <w:r>
+        <w:t xml:space="preserve">=</w:t>
+      </w:r>
+      <w:r>
+        <w:t xml:space="preserve"> </w:t>
+      </w:r>
+      <w:r>
+        <w:rPr>
+          <w:iCs/>
+          <w:i/>
+        </w:rPr>
+        <w:t xml:space="preserve">L</w:t>
+      </w:r>
+      <w:r>
+        <w:rPr>
+          <w:iCs/>
+          <w:i/>
+          <w:vertAlign w:val="subscript"/>
+        </w:rPr>
+        <w:t xml:space="preserve">i</w:t>
+      </w:r>
+      <w:r>
+        <w:rPr>
+          <w:vertAlign w:val="subscript"/>
+        </w:rPr>
+        <w:t xml:space="preserve">,</w:t>
+      </w:r>
+      <w:r>
+        <w:rPr>
+          <w:iCs/>
+          <w:i/>
+          <w:vertAlign w:val="subscript"/>
+        </w:rPr>
+        <w:t xml:space="preserve">d</w:t>
+      </w:r>
       <w:r>
         <w:t xml:space="preserve">. The event window runs from day 61, when a 60-day volume history exists, to five days before the sample end. The market return weights stocks by dollar volume,</w:t>
       </w:r>
@@ -1025,22 +1073,6 @@
               </m:nary>
             </m:den>
           </m:f>
-          <m:r>
-            <m:rPr>
-              <m:sty m:val="p"/>
-            </m:rPr>
-            <m:t>,</m:t>
-          </m:r>
-          <m:r>
-            <m:t>  </m:t>
-          </m:r>
-          <m:r>
-            <m:rPr>
-              <m:nor/>
-              <m:sty m:val="p"/>
-            </m:rPr>
-            <m:t>(2)</m:t>
-          </m:r>
         </m:oMath>
       </m:oMathPara>
     </w:p>
@@ -1049,16 +1081,26 @@
         <w:pStyle w:val="FirstParagraph"/>
       </w:pPr>
       <w:r>
+        <w:t xml:space="preserve">[[EQNUM:2]]</w:t>
+      </w:r>
+    </w:p>
+    <w:p>
+      <w:pPr>
+        <w:pStyle w:val="BodyText"/>
+      </w:pPr>
+      <w:r>
         <w:t xml:space="preserve">where</w:t>
       </w:r>
       <w:r>
         <w:t xml:space="preserve"> </w:t>
       </w:r>
-      <m:oMath>
-        <m:r>
-          <m:t>j</m:t>
-        </m:r>
-      </m:oMath>
+      <w:r>
+        <w:rPr>
+          <w:iCs/>
+          <w:i/>
+        </w:rPr>
+        <w:t xml:space="preserve">j</w:t>
+      </w:r>
       <w:r>
         <w:t xml:space="preserve"> </w:t>
       </w:r>
@@ -1068,22 +1110,26 @@
       <w:r>
         <w:t xml:space="preserve"> </w:t>
       </w:r>
-      <m:oMath>
-        <m:r>
-          <m:t>l</m:t>
-        </m:r>
-      </m:oMath>
+      <w:r>
+        <w:rPr>
+          <w:iCs/>
+          <w:i/>
+        </w:rPr>
+        <w:t xml:space="preserve">l</w:t>
+      </w:r>
       <w:r>
         <w:t xml:space="preserve"> </w:t>
       </w:r>
       <w:r>
         <w:t xml:space="preserve">run over stocks with a day-</w:t>
       </w:r>
-      <m:oMath>
-        <m:r>
-          <m:t>d</m:t>
-        </m:r>
-      </m:oMath>
+      <w:r>
+        <w:rPr>
+          <w:iCs/>
+          <w:i/>
+        </w:rPr>
+        <w:t xml:space="preserve">d</w:t>
+      </w:r>
       <w:r>
         <w:t xml:space="preserve"> </w:t>
       </w:r>
@@ -1093,36 +1139,35 @@
       <w:r>
         <w:t xml:space="preserve"> </w:t>
       </w:r>
-      <m:oMath>
-        <m:sSub>
-          <m:e>
-            <m:bar>
-              <m:barPr>
-                <m:pos m:val="top"/>
-              </m:barPr>
-              <m:e>
-                <m:r>
-                  <m:t>V</m:t>
-                </m:r>
-              </m:e>
-            </m:bar>
-          </m:e>
-          <m:sub>
-            <m:r>
-              <m:t>j</m:t>
-            </m:r>
-            <m:r>
-              <m:rPr>
-                <m:sty m:val="p"/>
-              </m:rPr>
-              <m:t>,</m:t>
-            </m:r>
-            <m:r>
-              <m:t>d</m:t>
-            </m:r>
-          </m:sub>
-        </m:sSub>
-      </m:oMath>
+      <w:r>
+        <w:rPr>
+          <w:iCs/>
+          <w:i/>
+        </w:rPr>
+        <w:t xml:space="preserve">V̄</w:t>
+      </w:r>
+      <w:r>
+        <w:rPr>
+          <w:iCs/>
+          <w:i/>
+          <w:vertAlign w:val="subscript"/>
+        </w:rPr>
+        <w:t xml:space="preserve">j</w:t>
+      </w:r>
+      <w:r>
+        <w:rPr>
+          <w:vertAlign w:val="subscript"/>
+        </w:rPr>
+        <w:t xml:space="preserve">,</w:t>
+      </w:r>
+      <w:r>
+        <w:rPr>
+          <w:iCs/>
+          <w:i/>
+          <w:vertAlign w:val="subscript"/>
+        </w:rPr>
+        <w:t xml:space="preserve">d</w:t>
+      </w:r>
       <w:r>
         <w:t xml:space="preserve"> </w:t>
       </w:r>
@@ -1132,11 +1177,13 @@
       <w:r>
         <w:t xml:space="preserve"> </w:t>
       </w:r>
-      <m:oMath>
-        <m:r>
-          <m:t>j</m:t>
-        </m:r>
-      </m:oMath>
+      <w:r>
+        <w:rPr>
+          <w:iCs/>
+          <w:i/>
+        </w:rPr>
+        <w:t xml:space="preserve">j</w:t>
+      </w:r>
       <w:r>
         <w:t xml:space="preserve"> </w:t>
       </w:r>
@@ -1146,11 +1193,13 @@
       <w:r>
         <w:t xml:space="preserve"> </w:t>
       </w:r>
-      <m:oMath>
-        <m:r>
-          <m:t>d</m:t>
-        </m:r>
-      </m:oMath>
+      <w:r>
+        <w:rPr>
+          <w:iCs/>
+          <w:i/>
+        </w:rPr>
+        <w:t xml:space="preserve">d</w:t>
+      </w:r>
       <w:r>
         <w:t xml:space="preserve">.</w:t>
       </w:r>
@@ -1170,31 +1219,14 @@
         <w:t xml:space="preserve"> </w:t>
       </w:r>
       <w:r>
-        <w:t xml:space="preserve">An exact hit is an event whose close equals the limit price (within</w:t>
-      </w:r>
-      <w:r>
-        <w:t xml:space="preserve"> </w:t>
-      </w:r>
-      <m:oMath>
-        <m:sSup>
-          <m:e>
-            <m:r>
-              <m:t>10</m:t>
-            </m:r>
-          </m:e>
-          <m:sup>
-            <m:r>
-              <m:rPr>
-                <m:sty m:val="p"/>
-              </m:rPr>
-              <m:t>−</m:t>
-            </m:r>
-            <m:r>
-              <m:t>6</m:t>
-            </m:r>
-          </m:sup>
-        </m:sSup>
-      </m:oMath>
+        <w:t xml:space="preserve">An exact hit is an event whose close equals the limit price (within 10</w:t>
+      </w:r>
+      <w:r>
+        <w:rPr>
+          <w:vertAlign w:val="superscript"/>
+        </w:rPr>
+        <w:t xml:space="preserve">−6</w:t>
+      </w:r>
       <w:r>
         <w:t xml:space="preserve"> </w:t>
       </w:r>
@@ -1414,22 +1446,6 @@
           <m:r>
             <m:t>δ</m:t>
           </m:r>
-          <m:r>
-            <m:rPr>
-              <m:sty m:val="p"/>
-            </m:rPr>
-            <m:t>,</m:t>
-          </m:r>
-          <m:r>
-            <m:t>  </m:t>
-          </m:r>
-          <m:r>
-            <m:rPr>
-              <m:nor/>
-              <m:sty m:val="p"/>
-            </m:rPr>
-            <m:t>(3)</m:t>
-          </m:r>
         </m:oMath>
       </m:oMathPara>
     </w:p>
@@ -1438,141 +1454,63 @@
         <w:pStyle w:val="FirstParagraph"/>
       </w:pPr>
       <w:r>
-        <w:t xml:space="preserve">where</w:t>
-      </w:r>
-      <w:r>
-        <w:t xml:space="preserve"> </w:t>
-      </w:r>
-      <m:oMath>
-        <m:r>
-          <m:rPr>
-            <m:sty m:val="p"/>
-          </m:rPr>
-          <m:t>⌊</m:t>
-        </m:r>
-        <m:r>
-          <m:rPr>
-            <m:sty m:val="p"/>
-          </m:rPr>
-          <m:t>⋅</m:t>
-        </m:r>
-        <m:r>
-          <m:rPr>
-            <m:sty m:val="p"/>
-          </m:rPr>
-          <m:t>⌋</m:t>
-        </m:r>
-      </m:oMath>
-      <w:r>
-        <w:t xml:space="preserve"> </w:t>
-      </w:r>
-      <w:r>
-        <w:t xml:space="preserve">and</w:t>
-      </w:r>
-      <w:r>
-        <w:t xml:space="preserve"> </w:t>
-      </w:r>
-      <m:oMath>
-        <m:r>
-          <m:rPr>
-            <m:sty m:val="p"/>
-          </m:rPr>
-          <m:t>⌈</m:t>
-        </m:r>
-        <m:r>
-          <m:rPr>
-            <m:sty m:val="p"/>
-          </m:rPr>
-          <m:t>⋅</m:t>
-        </m:r>
-        <m:r>
-          <m:rPr>
-            <m:sty m:val="p"/>
-          </m:rPr>
-          <m:t>⌉</m:t>
-        </m:r>
-      </m:oMath>
-      <w:r>
-        <w:t xml:space="preserve"> </w:t>
-      </w:r>
-      <w:r>
-        <w:t xml:space="preserve">round down and up (after adding and subtracting</w:t>
-      </w:r>
-      <w:r>
-        <w:t xml:space="preserve"> </w:t>
-      </w:r>
-      <m:oMath>
-        <m:sSup>
-          <m:e>
-            <m:r>
-              <m:t>10</m:t>
-            </m:r>
-          </m:e>
-          <m:sup>
-            <m:r>
-              <m:rPr>
-                <m:sty m:val="p"/>
-              </m:rPr>
-              <m:t>−</m:t>
-            </m:r>
-            <m:r>
-              <m:t>9</m:t>
-            </m:r>
-          </m:sup>
-        </m:sSup>
-      </m:oMath>
-      <w:r>
-        <w:t xml:space="preserve">, respectively, against floating-point error), and the tick</w:t>
-      </w:r>
-      <w:r>
-        <w:t xml:space="preserve"> </w:t>
-      </w:r>
-      <m:oMath>
-        <m:r>
-          <m:t>δ</m:t>
-        </m:r>
-      </m:oMath>
-      <w:r>
-        <w:t xml:space="preserve"> </w:t>
-      </w:r>
-      <w:r>
-        <w:t xml:space="preserve">is 0.01, 0.05, or 0.10 thousand dong for reference prices</w:t>
-      </w:r>
-      <w:r>
-        <w:t xml:space="preserve"> </w:t>
-      </w:r>
-      <m:oMath>
-        <m:sSub>
-          <m:e>
-            <m:r>
-              <m:t>C</m:t>
-            </m:r>
-          </m:e>
-          <m:sub>
-            <m:r>
-              <m:t>i</m:t>
-            </m:r>
-            <m:r>
-              <m:rPr>
-                <m:sty m:val="p"/>
-              </m:rPr>
-              <m:t>,</m:t>
-            </m:r>
-            <m:r>
-              <m:t>d</m:t>
-            </m:r>
-            <m:r>
-              <m:rPr>
-                <m:sty m:val="p"/>
-              </m:rPr>
-              <m:t>−</m:t>
-            </m:r>
-            <m:r>
-              <m:t>1</m:t>
-            </m:r>
-          </m:sub>
-        </m:sSub>
-      </m:oMath>
+        <w:t xml:space="preserve">[[EQNUM:3]]</w:t>
+      </w:r>
+    </w:p>
+    <w:p>
+      <w:pPr>
+        <w:pStyle w:val="BodyText"/>
+      </w:pPr>
+      <w:r>
+        <w:t xml:space="preserve">where ⌊ · ⌋ and ⌈ · ⌉ round down and up (after adding and subtracting 10</w:t>
+      </w:r>
+      <w:r>
+        <w:rPr>
+          <w:vertAlign w:val="superscript"/>
+        </w:rPr>
+        <w:t xml:space="preserve">−9</w:t>
+      </w:r>
+      <w:r>
+        <w:t xml:space="preserve">, respectively, against floating-point error), and the tick δ is 0.01, 0.05, or 0.10 thousand dong for reference prices</w:t>
+      </w:r>
+      <w:r>
+        <w:t xml:space="preserve"> </w:t>
+      </w:r>
+      <w:r>
+        <w:rPr>
+          <w:iCs/>
+          <w:i/>
+        </w:rPr>
+        <w:t xml:space="preserve">C</w:t>
+      </w:r>
+      <w:r>
+        <w:rPr>
+          <w:iCs/>
+          <w:i/>
+          <w:vertAlign w:val="subscript"/>
+        </w:rPr>
+        <w:t xml:space="preserve">i</w:t>
+      </w:r>
+      <w:r>
+        <w:rPr>
+          <w:vertAlign w:val="subscript"/>
+        </w:rPr>
+        <w:t xml:space="preserve">,</w:t>
+      </w:r>
+      <w:r>
+        <w:rPr>
+          <w:iCs/>
+          <w:i/>
+          <w:vertAlign w:val="subscript"/>
+        </w:rPr>
+        <w:t xml:space="preserve">d</w:t>
+      </w:r>
+      <w:r>
+        <w:rPr>
+          <w:vertAlign w:val="subscript"/>
+        </w:rPr>
+        <w:t xml:space="preserve">−1</w:t>
+      </w:r>
       <w:r>
         <w:t xml:space="preserve"> </w:t>
       </w:r>
@@ -1600,71 +1538,50 @@
       <w:r>
         <w:t xml:space="preserve"> </w:t>
       </w:r>
-      <m:oMath>
-        <m:r>
-          <m:t>d</m:t>
-        </m:r>
-        <m:r>
-          <m:rPr>
-            <m:sty m:val="p"/>
-          </m:rPr>
-          <m:t>+</m:t>
-        </m:r>
-        <m:r>
-          <m:t>1</m:t>
-        </m:r>
-      </m:oMath>
-      <w:r>
-        <w:t xml:space="preserve"> </w:t>
-      </w:r>
-      <w:r>
-        <w:t xml:space="preserve">and the cumulative abnormal return (CAR) over days</w:t>
-      </w:r>
-      <w:r>
-        <w:t xml:space="preserve"> </w:t>
-      </w:r>
-      <m:oMath>
-        <m:r>
-          <m:t>d</m:t>
-        </m:r>
-        <m:r>
-          <m:rPr>
-            <m:sty m:val="p"/>
-          </m:rPr>
-          <m:t>+</m:t>
-        </m:r>
-        <m:r>
-          <m:t>1</m:t>
-        </m:r>
-      </m:oMath>
-      <w:r>
-        <w:t xml:space="preserve"> </w:t>
-      </w:r>
-      <w:r>
-        <w:t xml:space="preserve">to</w:t>
-      </w:r>
-      <w:r>
-        <w:t xml:space="preserve"> </w:t>
-      </w:r>
-      <m:oMath>
-        <m:r>
-          <m:t>d</m:t>
-        </m:r>
-        <m:r>
-          <m:rPr>
-            <m:sty m:val="p"/>
-          </m:rPr>
-          <m:t>+</m:t>
-        </m:r>
-        <m:r>
-          <m:t>5</m:t>
-        </m:r>
-      </m:oMath>
-      <w:r>
-        <w:t xml:space="preserve"> </w:t>
-      </w:r>
-      <w:r>
-        <w:t xml:space="preserve">are</w:t>
+      <w:r>
+        <w:rPr>
+          <w:iCs/>
+          <w:i/>
+        </w:rPr>
+        <w:t xml:space="preserve">d</w:t>
+      </w:r>
+      <w:r>
+        <w:t xml:space="preserve"> </w:t>
+      </w:r>
+      <w:r>
+        <w:t xml:space="preserve">+ 1 and the cumulative abnormal return (CAR) over days</w:t>
+      </w:r>
+      <w:r>
+        <w:t xml:space="preserve"> </w:t>
+      </w:r>
+      <w:r>
+        <w:rPr>
+          <w:iCs/>
+          <w:i/>
+        </w:rPr>
+        <w:t xml:space="preserve">d</w:t>
+      </w:r>
+      <w:r>
+        <w:t xml:space="preserve"> </w:t>
+      </w:r>
+      <w:r>
+        <w:t xml:space="preserve">+ 1 to</w:t>
+      </w:r>
+      <w:r>
+        <w:t xml:space="preserve"> </w:t>
+      </w:r>
+      <w:r>
+        <w:rPr>
+          <w:iCs/>
+          <w:i/>
+        </w:rPr>
+        <w:t xml:space="preserve">d</w:t>
+      </w:r>
+      <w:r>
+        <w:t xml:space="preserve"> </w:t>
+      </w:r>
+      <w:r>
+        <w:t xml:space="preserve">+ 5 are</w:t>
       </w:r>
     </w:p>
     <w:p>
@@ -1991,22 +1908,6 @@
               </m:d>
             </m:e>
           </m:nary>
-          <m:r>
-            <m:rPr>
-              <m:sty m:val="p"/>
-            </m:rPr>
-            <m:t>,</m:t>
-          </m:r>
-          <m:r>
-            <m:t>  </m:t>
-          </m:r>
-          <m:r>
-            <m:rPr>
-              <m:nor/>
-              <m:sty m:val="p"/>
-            </m:rPr>
-            <m:t>(4)</m:t>
-          </m:r>
         </m:oMath>
       </m:oMathPara>
     </w:p>
@@ -2015,43 +1916,54 @@
         <w:pStyle w:val="FirstParagraph"/>
       </w:pPr>
       <w:r>
+        <w:t xml:space="preserve">[[EQNUM:4]]</w:t>
+      </w:r>
+    </w:p>
+    <w:p>
+      <w:pPr>
+        <w:pStyle w:val="BodyText"/>
+      </w:pPr>
+      <w:r>
         <w:t xml:space="preserve">where each</w:t>
       </w:r>
       <w:r>
         <w:t xml:space="preserve"> </w:t>
       </w:r>
-      <m:oMath>
-        <m:sSubSup>
-          <m:e>
-            <m:r>
-              <m:t>R</m:t>
-            </m:r>
-          </m:e>
-          <m:sub>
-            <m:r>
-              <m:t>d</m:t>
-            </m:r>
-            <m:r>
-              <m:rPr>
-                <m:sty m:val="p"/>
-              </m:rPr>
-              <m:t>+</m:t>
-            </m:r>
-            <m:r>
-              <m:t>k</m:t>
-            </m:r>
-          </m:sub>
-          <m:sup>
-            <m:r>
-              <m:rPr>
-                <m:nor/>
-                <m:sty m:val="p"/>
-              </m:rPr>
-              <m:t>mkt</m:t>
-            </m:r>
-          </m:sup>
-        </m:sSubSup>
-      </m:oMath>
+      <w:r>
+        <w:rPr>
+          <w:iCs/>
+          <w:i/>
+        </w:rPr>
+        <w:t xml:space="preserve">R</w:t>
+      </w:r>
+      <w:r>
+        <w:rPr>
+          <w:vertAlign w:val="superscript"/>
+        </w:rPr>
+        <w:t xml:space="preserve">mkt</w:t>
+      </w:r>
+      <w:r>
+        <w:rPr>
+          <w:iCs/>
+          <w:i/>
+          <w:vertAlign w:val="subscript"/>
+        </w:rPr>
+        <w:t xml:space="preserve">d</w:t>
+      </w:r>
+      <w:r>
+        <w:rPr>
+          <w:vertAlign w:val="subscript"/>
+        </w:rPr>
+        <w:t xml:space="preserve">+</w:t>
+      </w:r>
+      <w:r>
+        <w:rPr>
+          <w:iCs/>
+          <w:i/>
+          <w:vertAlign w:val="subscript"/>
+        </w:rPr>
+        <w:t xml:space="preserve">k</w:t>
+      </w:r>
       <w:r>
         <w:t xml:space="preserve"> </w:t>
       </w:r>
@@ -2061,45 +1973,47 @@
       <w:r>
         <w:t xml:space="preserve"> </w:t>
       </w:r>
-      <m:oMath>
-        <m:r>
-          <m:t>d</m:t>
-        </m:r>
-        <m:r>
-          <m:rPr>
-            <m:sty m:val="p"/>
-          </m:rPr>
-          <m:t>+</m:t>
-        </m:r>
-        <m:r>
-          <m:t>k</m:t>
-        </m:r>
-      </m:oMath>
+      <w:r>
+        <w:rPr>
+          <w:iCs/>
+          <w:i/>
+        </w:rPr>
+        <w:t xml:space="preserve">d</w:t>
+      </w:r>
+      <w:r>
+        <w:t xml:space="preserve"> </w:t>
+      </w:r>
+      <w:r>
+        <w:t xml:space="preserve">+</w:t>
+      </w:r>
+      <w:r>
+        <w:t xml:space="preserve"> </w:t>
+      </w:r>
+      <w:r>
+        <w:rPr>
+          <w:iCs/>
+          <w:i/>
+        </w:rPr>
+        <w:t xml:space="preserve">k</w:t>
+      </w:r>
       <w:r>
         <w:t xml:space="preserve"> </w:t>
       </w:r>
       <w:r>
         <w:t xml:space="preserve">(Table 1). The day-</w:t>
       </w:r>
-      <m:oMath>
-        <m:r>
-          <m:t>d</m:t>
-        </m:r>
-        <m:r>
-          <m:rPr>
-            <m:sty m:val="p"/>
-          </m:rPr>
-          <m:t>+</m:t>
-        </m:r>
-        <m:r>
-          <m:t>1</m:t>
-        </m:r>
-      </m:oMath>
-      <w:r>
-        <w:t xml:space="preserve"> </w:t>
-      </w:r>
-      <w:r>
-        <w:t xml:space="preserve">return splits into the overnight gap and the intraday return,</w:t>
+      <w:r>
+        <w:rPr>
+          <w:iCs/>
+          <w:i/>
+        </w:rPr>
+        <w:t xml:space="preserve">d</w:t>
+      </w:r>
+      <w:r>
+        <w:t xml:space="preserve"> </w:t>
+      </w:r>
+      <w:r>
+        <w:t xml:space="preserve">+ 1 return splits into the overnight gap and the intraday return,</w:t>
       </w:r>
     </w:p>
     <w:p>
@@ -2539,22 +2453,6 @@
               </m:sSub>
             </m:e>
           </m:d>
-          <m:r>
-            <m:rPr>
-              <m:sty m:val="p"/>
-            </m:rPr>
-            <m:t>,</m:t>
-          </m:r>
-          <m:r>
-            <m:t>  </m:t>
-          </m:r>
-          <m:r>
-            <m:rPr>
-              <m:nor/>
-              <m:sty m:val="p"/>
-            </m:rPr>
-            <m:t>(5)</m:t>
-          </m:r>
         </m:oMath>
       </m:oMathPara>
     </w:p>
@@ -2563,265 +2461,265 @@
         <w:pStyle w:val="FirstParagraph"/>
       </w:pPr>
       <w:r>
+        <w:t xml:space="preserve">[[EQNUM:5]]</w:t>
+      </w:r>
+    </w:p>
+    <w:p>
+      <w:pPr>
+        <w:pStyle w:val="BodyText"/>
+      </w:pPr>
+      <w:r>
         <w:t xml:space="preserve">and abnormal values subtract the market counterpart of each component, the same-interval return across stocks weighted by</w:t>
       </w:r>
       <w:r>
         <w:t xml:space="preserve"> </w:t>
       </w:r>
-      <m:oMath>
-        <m:sSub>
-          <m:e>
-            <m:r>
-              <m:t>w</m:t>
-            </m:r>
-          </m:e>
-          <m:sub>
-            <m:r>
-              <m:t>j</m:t>
-            </m:r>
-            <m:r>
-              <m:rPr>
-                <m:sty m:val="p"/>
-              </m:rPr>
-              <m:t>,</m:t>
-            </m:r>
-            <m:r>
-              <m:t>d</m:t>
-            </m:r>
-          </m:sub>
-        </m:sSub>
-      </m:oMath>
+      <w:r>
+        <w:rPr>
+          <w:iCs/>
+          <w:i/>
+        </w:rPr>
+        <w:t xml:space="preserve">w</w:t>
+      </w:r>
+      <w:r>
+        <w:rPr>
+          <w:iCs/>
+          <w:i/>
+          <w:vertAlign w:val="subscript"/>
+        </w:rPr>
+        <w:t xml:space="preserve">j</w:t>
+      </w:r>
+      <w:r>
+        <w:rPr>
+          <w:vertAlign w:val="subscript"/>
+        </w:rPr>
+        <w:t xml:space="preserve">,</w:t>
+      </w:r>
+      <w:r>
+        <w:rPr>
+          <w:iCs/>
+          <w:i/>
+          <w:vertAlign w:val="subscript"/>
+        </w:rPr>
+        <w:t xml:space="preserve">d</w:t>
+      </w:r>
       <w:r>
         <w:t xml:space="preserve">, known at the event close. A buyer at the next open earns</w:t>
       </w:r>
       <w:r>
         <w:t xml:space="preserve"> </w:t>
       </w:r>
-      <m:oMath>
-        <m:sSub>
-          <m:e>
-            <m:r>
-              <m:t>C</m:t>
-            </m:r>
-          </m:e>
-          <m:sub>
-            <m:r>
-              <m:t>i</m:t>
-            </m:r>
-            <m:r>
-              <m:rPr>
-                <m:sty m:val="p"/>
-              </m:rPr>
-              <m:t>,</m:t>
-            </m:r>
-            <m:r>
-              <m:t>d</m:t>
-            </m:r>
-            <m:r>
-              <m:rPr>
-                <m:sty m:val="p"/>
-              </m:rPr>
-              <m:t>+</m:t>
-            </m:r>
-            <m:r>
-              <m:t>5</m:t>
-            </m:r>
-          </m:sub>
-        </m:sSub>
-        <m:r>
-          <m:rPr>
-            <m:sty m:val="p"/>
-          </m:rPr>
-          <m:t>/</m:t>
-        </m:r>
-        <m:sSub>
-          <m:e>
-            <m:r>
-              <m:t>O</m:t>
-            </m:r>
-          </m:e>
-          <m:sub>
-            <m:r>
-              <m:t>i</m:t>
-            </m:r>
-            <m:r>
-              <m:rPr>
-                <m:sty m:val="p"/>
-              </m:rPr>
-              <m:t>,</m:t>
-            </m:r>
-            <m:r>
-              <m:t>d</m:t>
-            </m:r>
-            <m:r>
-              <m:rPr>
-                <m:sty m:val="p"/>
-              </m:rPr>
-              <m:t>+</m:t>
-            </m:r>
-            <m:r>
-              <m:t>1</m:t>
-            </m:r>
-          </m:sub>
-        </m:sSub>
-        <m:r>
-          <m:rPr>
-            <m:sty m:val="p"/>
-          </m:rPr>
-          <m:t>−</m:t>
-        </m:r>
-        <m:r>
-          <m:t>1</m:t>
-        </m:r>
-      </m:oMath>
-      <w:r>
-        <w:t xml:space="preserve"> </w:t>
-      </w:r>
-      <w:r>
-        <w:t xml:space="preserve">less the buy-and-hold market return</w:t>
-      </w:r>
-      <w:r>
-        <w:t xml:space="preserve"> </w:t>
-      </w:r>
-      <m:oMath>
-        <m:nary>
-          <m:naryPr>
-            <m:chr m:val="∑"/>
-            <m:limLoc m:val="undOvr"/>
-            <m:subHide m:val="off"/>
-            <m:supHide m:val="on"/>
-          </m:naryPr>
-          <m:sub>
-            <m:r>
-              <m:t>j</m:t>
-            </m:r>
-          </m:sub>
-          <m:sup>
-            <m:r>
-              <m:t>​</m:t>
-            </m:r>
-          </m:sup>
-          <m:e>
-            <m:sSub>
-              <m:e>
-                <m:r>
-                  <m:t>w</m:t>
-                </m:r>
-              </m:e>
-              <m:sub>
-                <m:r>
-                  <m:t>j</m:t>
-                </m:r>
-                <m:r>
-                  <m:rPr>
-                    <m:sty m:val="p"/>
-                  </m:rPr>
-                  <m:t>,</m:t>
-                </m:r>
-                <m:r>
-                  <m:t>d</m:t>
-                </m:r>
-              </m:sub>
-            </m:sSub>
-          </m:e>
-        </m:nary>
-        <m:r>
-          <m:t> </m:t>
-        </m:r>
-        <m:d>
-          <m:dPr>
-            <m:begChr m:val="("/>
-            <m:endChr m:val=")"/>
-            <m:sepChr m:val=""/>
-            <m:grow/>
-          </m:dPr>
-          <m:e>
-            <m:sSub>
-              <m:e>
-                <m:r>
-                  <m:t>C</m:t>
-                </m:r>
-              </m:e>
-              <m:sub>
-                <m:r>
-                  <m:t>j</m:t>
-                </m:r>
-                <m:r>
-                  <m:rPr>
-                    <m:sty m:val="p"/>
-                  </m:rPr>
-                  <m:t>,</m:t>
-                </m:r>
-                <m:r>
-                  <m:t>d</m:t>
-                </m:r>
-                <m:r>
-                  <m:rPr>
-                    <m:sty m:val="p"/>
-                  </m:rPr>
-                  <m:t>+</m:t>
-                </m:r>
-                <m:r>
-                  <m:t>5</m:t>
-                </m:r>
-              </m:sub>
-            </m:sSub>
-            <m:r>
-              <m:rPr>
-                <m:sty m:val="p"/>
-              </m:rPr>
-              <m:t>/</m:t>
-            </m:r>
-            <m:sSub>
-              <m:e>
-                <m:r>
-                  <m:t>O</m:t>
-                </m:r>
-              </m:e>
-              <m:sub>
-                <m:r>
-                  <m:t>j</m:t>
-                </m:r>
-                <m:r>
-                  <m:rPr>
-                    <m:sty m:val="p"/>
-                  </m:rPr>
-                  <m:t>,</m:t>
-                </m:r>
-                <m:r>
-                  <m:t>d</m:t>
-                </m:r>
-                <m:r>
-                  <m:rPr>
-                    <m:sty m:val="p"/>
-                  </m:rPr>
-                  <m:t>+</m:t>
-                </m:r>
-                <m:r>
-                  <m:t>1</m:t>
-                </m:r>
-              </m:sub>
-            </m:sSub>
-            <m:r>
-              <m:rPr>
-                <m:sty m:val="p"/>
-              </m:rPr>
-              <m:t>−</m:t>
-            </m:r>
-            <m:r>
-              <m:t>1</m:t>
-            </m:r>
-          </m:e>
-        </m:d>
-      </m:oMath>
-      <w:r>
-        <w:t xml:space="preserve">. The control benchmark is the equal-weighted mean same-interval return of control stocks (absolute day-</w:t>
-      </w:r>
-      <m:oMath>
-        <m:r>
-          <m:t>d</m:t>
-        </m:r>
-      </m:oMath>
+      <w:r>
+        <w:rPr>
+          <w:iCs/>
+          <w:i/>
+        </w:rPr>
+        <w:t xml:space="preserve">C</w:t>
+      </w:r>
+      <w:r>
+        <w:rPr>
+          <w:iCs/>
+          <w:i/>
+          <w:vertAlign w:val="subscript"/>
+        </w:rPr>
+        <w:t xml:space="preserve">i</w:t>
+      </w:r>
+      <w:r>
+        <w:rPr>
+          <w:vertAlign w:val="subscript"/>
+        </w:rPr>
+        <w:t xml:space="preserve">,</w:t>
+      </w:r>
+      <w:r>
+        <w:rPr>
+          <w:iCs/>
+          <w:i/>
+          <w:vertAlign w:val="subscript"/>
+        </w:rPr>
+        <w:t xml:space="preserve">d</w:t>
+      </w:r>
+      <w:r>
+        <w:rPr>
+          <w:vertAlign w:val="subscript"/>
+        </w:rPr>
+        <w:t xml:space="preserve">+5</w:t>
+      </w:r>
+      <w:r>
+        <w:t xml:space="preserve">/</w:t>
+      </w:r>
+      <w:r>
+        <w:rPr>
+          <w:iCs/>
+          <w:i/>
+        </w:rPr>
+        <w:t xml:space="preserve">O</w:t>
+      </w:r>
+      <w:r>
+        <w:rPr>
+          <w:iCs/>
+          <w:i/>
+          <w:vertAlign w:val="subscript"/>
+        </w:rPr>
+        <w:t xml:space="preserve">i</w:t>
+      </w:r>
+      <w:r>
+        <w:rPr>
+          <w:vertAlign w:val="subscript"/>
+        </w:rPr>
+        <w:t xml:space="preserve">,</w:t>
+      </w:r>
+      <w:r>
+        <w:rPr>
+          <w:iCs/>
+          <w:i/>
+          <w:vertAlign w:val="subscript"/>
+        </w:rPr>
+        <w:t xml:space="preserve">d</w:t>
+      </w:r>
+      <w:r>
+        <w:rPr>
+          <w:vertAlign w:val="subscript"/>
+        </w:rPr>
+        <w:t xml:space="preserve">+1</w:t>
+      </w:r>
+      <w:r>
+        <w:t xml:space="preserve"> </w:t>
+      </w:r>
+      <w:r>
+        <w:t xml:space="preserve">− 1 less the buy-and-hold market return Σ</w:t>
+      </w:r>
+      <w:r>
+        <w:rPr>
+          <w:iCs/>
+          <w:i/>
+          <w:vertAlign w:val="subscript"/>
+        </w:rPr>
+        <w:t xml:space="preserve">j</w:t>
+      </w:r>
+      <w:r>
+        <w:t xml:space="preserve"> </w:t>
+      </w:r>
+      <w:r>
+        <w:rPr>
+          <w:iCs/>
+          <w:i/>
+        </w:rPr>
+        <w:t xml:space="preserve">w</w:t>
+      </w:r>
+      <w:r>
+        <w:rPr>
+          <w:iCs/>
+          <w:i/>
+          <w:vertAlign w:val="subscript"/>
+        </w:rPr>
+        <w:t xml:space="preserve">j</w:t>
+      </w:r>
+      <w:r>
+        <w:rPr>
+          <w:vertAlign w:val="subscript"/>
+        </w:rPr>
+        <w:t xml:space="preserve">,</w:t>
+      </w:r>
+      <w:r>
+        <w:rPr>
+          <w:iCs/>
+          <w:i/>
+          <w:vertAlign w:val="subscript"/>
+        </w:rPr>
+        <w:t xml:space="preserve">d</w:t>
+      </w:r>
+      <w:r>
+        <w:t xml:space="preserve"> </w:t>
+      </w:r>
+      <w:r>
+        <w:t xml:space="preserve">(</w:t>
+      </w:r>
+      <w:r>
+        <w:rPr>
+          <w:iCs/>
+          <w:i/>
+        </w:rPr>
+        <w:t xml:space="preserve">C</w:t>
+      </w:r>
+      <w:r>
+        <w:rPr>
+          <w:iCs/>
+          <w:i/>
+          <w:vertAlign w:val="subscript"/>
+        </w:rPr>
+        <w:t xml:space="preserve">j</w:t>
+      </w:r>
+      <w:r>
+        <w:rPr>
+          <w:vertAlign w:val="subscript"/>
+        </w:rPr>
+        <w:t xml:space="preserve">,</w:t>
+      </w:r>
+      <w:r>
+        <w:rPr>
+          <w:iCs/>
+          <w:i/>
+          <w:vertAlign w:val="subscript"/>
+        </w:rPr>
+        <w:t xml:space="preserve">d</w:t>
+      </w:r>
+      <w:r>
+        <w:rPr>
+          <w:vertAlign w:val="subscript"/>
+        </w:rPr>
+        <w:t xml:space="preserve">+5</w:t>
+      </w:r>
+      <w:r>
+        <w:t xml:space="preserve">/</w:t>
+      </w:r>
+      <w:r>
+        <w:rPr>
+          <w:iCs/>
+          <w:i/>
+        </w:rPr>
+        <w:t xml:space="preserve">O</w:t>
+      </w:r>
+      <w:r>
+        <w:rPr>
+          <w:iCs/>
+          <w:i/>
+          <w:vertAlign w:val="subscript"/>
+        </w:rPr>
+        <w:t xml:space="preserve">j</w:t>
+      </w:r>
+      <w:r>
+        <w:rPr>
+          <w:vertAlign w:val="subscript"/>
+        </w:rPr>
+        <w:t xml:space="preserve">,</w:t>
+      </w:r>
+      <w:r>
+        <w:rPr>
+          <w:iCs/>
+          <w:i/>
+          <w:vertAlign w:val="subscript"/>
+        </w:rPr>
+        <w:t xml:space="preserve">d</w:t>
+      </w:r>
+      <w:r>
+        <w:rPr>
+          <w:vertAlign w:val="subscript"/>
+        </w:rPr>
+        <w:t xml:space="preserve">+1</w:t>
+      </w:r>
+      <w:r>
+        <w:t xml:space="preserve"> </w:t>
+      </w:r>
+      <w:r>
+        <w:t xml:space="preserve">− 1). The control benchmark is the equal-weighted mean same-interval return of control stocks (absolute day-</w:t>
+      </w:r>
+      <w:r>
+        <w:rPr>
+          <w:iCs/>
+          <w:i/>
+        </w:rPr>
+        <w:t xml:space="preserve">d</w:t>
+      </w:r>
       <w:r>
         <w:t xml:space="preserve"> </w:t>
       </w:r>
@@ -2831,36 +2729,35 @@
       <w:r>
         <w:t xml:space="preserve"> </w:t>
       </w:r>
-      <m:oMath>
-        <m:sSub>
-          <m:e>
-            <m:bar>
-              <m:barPr>
-                <m:pos m:val="top"/>
-              </m:barPr>
-              <m:e>
-                <m:r>
-                  <m:t>V</m:t>
-                </m:r>
-              </m:e>
-            </m:bar>
-          </m:e>
-          <m:sub>
-            <m:r>
-              <m:t>i</m:t>
-            </m:r>
-            <m:r>
-              <m:rPr>
-                <m:sty m:val="p"/>
-              </m:rPr>
-              <m:t>,</m:t>
-            </m:r>
-            <m:r>
-              <m:t>d</m:t>
-            </m:r>
-          </m:sub>
-        </m:sSub>
-      </m:oMath>
+      <w:r>
+        <w:rPr>
+          <w:iCs/>
+          <w:i/>
+        </w:rPr>
+        <w:t xml:space="preserve">V̄</w:t>
+      </w:r>
+      <w:r>
+        <w:rPr>
+          <w:iCs/>
+          <w:i/>
+          <w:vertAlign w:val="subscript"/>
+        </w:rPr>
+        <w:t xml:space="preserve">i</w:t>
+      </w:r>
+      <w:r>
+        <w:rPr>
+          <w:vertAlign w:val="subscript"/>
+        </w:rPr>
+        <w:t xml:space="preserve">,</w:t>
+      </w:r>
+      <w:r>
+        <w:rPr>
+          <w:iCs/>
+          <w:i/>
+          <w:vertAlign w:val="subscript"/>
+        </w:rPr>
+        <w:t xml:space="preserve">d</w:t>
+      </w:r>
       <w:r>
         <w:t xml:space="preserve"> </w:t>
       </w:r>
@@ -2939,11 +2836,13 @@
       <w:r>
         <w:t xml:space="preserve"> </w:t>
       </w:r>
-      <m:oMath>
-        <m:r>
-          <m:t>N</m:t>
-        </m:r>
-      </m:oMath>
+      <w:r>
+        <w:rPr>
+          <w:iCs/>
+          <w:i/>
+        </w:rPr>
+        <w:t xml:space="preserve">N</w:t>
+      </w:r>
       <w:r>
         <w:t xml:space="preserve"> </w:t>
       </w:r>
@@ -2953,31 +2852,34 @@
       <w:r>
         <w:t xml:space="preserve"> </w:t>
       </w:r>
-      <m:oMath>
-        <m:r>
-          <m:t>e</m:t>
-        </m:r>
-      </m:oMath>
+      <w:r>
+        <w:rPr>
+          <w:iCs/>
+          <w:i/>
+        </w:rPr>
+        <w:t xml:space="preserve">e</w:t>
+      </w:r>
       <w:r>
         <w:t xml:space="preserve">, each a stock-day pair, with outcome</w:t>
       </w:r>
       <w:r>
         <w:t xml:space="preserve"> </w:t>
       </w:r>
-      <m:oMath>
-        <m:sSub>
-          <m:e>
-            <m:r>
-              <m:t>y</m:t>
-            </m:r>
-          </m:e>
-          <m:sub>
-            <m:r>
-              <m:t>e</m:t>
-            </m:r>
-          </m:sub>
-        </m:sSub>
-      </m:oMath>
+      <w:r>
+        <w:rPr>
+          <w:iCs/>
+          <w:i/>
+        </w:rPr>
+        <w:t xml:space="preserve">y</w:t>
+      </w:r>
+      <w:r>
+        <w:rPr>
+          <w:iCs/>
+          <w:i/>
+          <w:vertAlign w:val="subscript"/>
+        </w:rPr>
+        <w:t xml:space="preserve">e</w:t>
+      </w:r>
       <w:r>
         <w:t xml:space="preserve"> </w:t>
       </w:r>
@@ -2987,74 +2889,64 @@
       <w:r>
         <w:t xml:space="preserve"> </w:t>
       </w:r>
-      <m:oMath>
-        <m:bar>
-          <m:barPr>
-            <m:pos m:val="top"/>
-          </m:barPr>
-          <m:e>
-            <m:r>
-              <m:t>y</m:t>
-            </m:r>
-          </m:e>
-        </m:bar>
-        <m:r>
-          <m:rPr>
-            <m:sty m:val="p"/>
-          </m:rPr>
-          <m:t>=</m:t>
-        </m:r>
-        <m:sSup>
-          <m:e>
-            <m:r>
-              <m:t>N</m:t>
-            </m:r>
-          </m:e>
-          <m:sup>
-            <m:r>
-              <m:rPr>
-                <m:sty m:val="p"/>
-              </m:rPr>
-              <m:t>−</m:t>
-            </m:r>
-            <m:r>
-              <m:t>1</m:t>
-            </m:r>
-          </m:sup>
-        </m:sSup>
-        <m:nary>
-          <m:naryPr>
-            <m:chr m:val="∑"/>
-            <m:limLoc m:val="undOvr"/>
-            <m:subHide m:val="off"/>
-            <m:supHide m:val="on"/>
-          </m:naryPr>
-          <m:sub>
-            <m:r>
-              <m:t>e</m:t>
-            </m:r>
-          </m:sub>
-          <m:sup>
-            <m:r>
-              <m:t>​</m:t>
-            </m:r>
-          </m:sup>
-          <m:e>
-            <m:sSub>
-              <m:e>
-                <m:r>
-                  <m:t>y</m:t>
-                </m:r>
-              </m:e>
-              <m:sub>
-                <m:r>
-                  <m:t>e</m:t>
-                </m:r>
-              </m:sub>
-            </m:sSub>
-          </m:e>
-        </m:nary>
-      </m:oMath>
+      <w:r>
+        <w:rPr>
+          <w:iCs/>
+          <w:i/>
+        </w:rPr>
+        <w:t xml:space="preserve">ȳ</w:t>
+      </w:r>
+      <w:r>
+        <w:t xml:space="preserve"> </w:t>
+      </w:r>
+      <w:r>
+        <w:t xml:space="preserve">=</w:t>
+      </w:r>
+      <w:r>
+        <w:t xml:space="preserve"> </w:t>
+      </w:r>
+      <w:r>
+        <w:rPr>
+          <w:iCs/>
+          <w:i/>
+        </w:rPr>
+        <w:t xml:space="preserve">N</w:t>
+      </w:r>
+      <w:r>
+        <w:rPr>
+          <w:vertAlign w:val="superscript"/>
+        </w:rPr>
+        <w:t xml:space="preserve">−1</w:t>
+      </w:r>
+      <w:r>
+        <w:t xml:space="preserve">Σ</w:t>
+      </w:r>
+      <w:r>
+        <w:rPr>
+          <w:iCs/>
+          <w:i/>
+          <w:vertAlign w:val="subscript"/>
+        </w:rPr>
+        <w:t xml:space="preserve">e</w:t>
+      </w:r>
+      <w:r>
+        <w:t xml:space="preserve"> </w:t>
+      </w:r>
+      <w:r>
+        <w:rPr>
+          <w:iCs/>
+          <w:i/>
+        </w:rPr>
+        <w:t xml:space="preserve">y</w:t>
+      </w:r>
+      <w:r>
+        <w:rPr>
+          <w:iCs/>
+          <w:i/>
+          <w:vertAlign w:val="subscript"/>
+        </w:rPr>
+        <w:t xml:space="preserve">e</w:t>
+      </w:r>
       <w:r>
         <w:t xml:space="preserve">, the cluster-robust variance is</w:t>
       </w:r>
@@ -3276,22 +3168,6 @@
               </m:sSup>
             </m:e>
           </m:nary>
-          <m:r>
-            <m:rPr>
-              <m:sty m:val="p"/>
-            </m:rPr>
-            <m:t>,</m:t>
-          </m:r>
-          <m:r>
-            <m:t>  </m:t>
-          </m:r>
-          <m:r>
-            <m:rPr>
-              <m:nor/>
-              <m:sty m:val="p"/>
-            </m:rPr>
-            <m:t>(6)</m:t>
-          </m:r>
         </m:oMath>
       </m:oMathPara>
     </w:p>
@@ -3300,46 +3176,42 @@
         <w:pStyle w:val="FirstParagraph"/>
       </w:pPr>
       <w:r>
+        <w:t xml:space="preserve">[[EQNUM:6]]</w:t>
+      </w:r>
+    </w:p>
+    <w:p>
+      <w:pPr>
+        <w:pStyle w:val="BodyText"/>
+      </w:pPr>
+      <w:r>
         <w:t xml:space="preserve">where</w:t>
       </w:r>
       <w:r>
         <w:t xml:space="preserve"> </w:t>
       </w:r>
-      <m:oMath>
-        <m:r>
-          <m:t>g</m:t>
-        </m:r>
-        <m:r>
-          <m:rPr>
-            <m:sty m:val="p"/>
-          </m:rPr>
-          <m:t>=</m:t>
-        </m:r>
-        <m:r>
-          <m:t>1</m:t>
-        </m:r>
-        <m:r>
-          <m:rPr>
-            <m:sty m:val="p"/>
-          </m:rPr>
-          <m:t>,</m:t>
-        </m:r>
-        <m:r>
-          <m:rPr>
-            <m:sty m:val="p"/>
-          </m:rPr>
-          <m:t>…</m:t>
-        </m:r>
-        <m:r>
-          <m:rPr>
-            <m:sty m:val="p"/>
-          </m:rPr>
-          <m:t>,</m:t>
-        </m:r>
-        <m:r>
-          <m:t>G</m:t>
-        </m:r>
-      </m:oMath>
+      <w:r>
+        <w:rPr>
+          <w:iCs/>
+          <w:i/>
+        </w:rPr>
+        <w:t xml:space="preserve">g</w:t>
+      </w:r>
+      <w:r>
+        <w:t xml:space="preserve"> </w:t>
+      </w:r>
+      <w:r>
+        <w:t xml:space="preserve">= 1, …,</w:t>
+      </w:r>
+      <w:r>
+        <w:t xml:space="preserve"> </w:t>
+      </w:r>
+      <w:r>
+        <w:rPr>
+          <w:iCs/>
+          <w:i/>
+        </w:rPr>
+        <w:t xml:space="preserve">G</w:t>
+      </w:r>
       <w:r>
         <w:t xml:space="preserve"> </w:t>
       </w:r>
@@ -3362,41 +3234,28 @@
       <w:r>
         <w:t xml:space="preserve"> </w:t>
       </w:r>
-      <m:oMath>
-        <m:r>
-          <m:t>G</m:t>
-        </m:r>
-        <m:r>
-          <m:rPr>
-            <m:sty m:val="p"/>
-          </m:rPr>
-          <m:t>/</m:t>
-        </m:r>
-        <m:d>
-          <m:dPr>
-            <m:begChr m:val="("/>
-            <m:endChr m:val=")"/>
-            <m:sepChr m:val=""/>
-            <m:grow/>
-          </m:dPr>
-          <m:e>
-            <m:r>
-              <m:t>G</m:t>
-            </m:r>
-            <m:r>
-              <m:rPr>
-                <m:sty m:val="p"/>
-              </m:rPr>
-              <m:t>−</m:t>
-            </m:r>
-            <m:r>
-              <m:t>1</m:t>
-            </m:r>
-          </m:e>
-        </m:d>
-      </m:oMath>
-      <w:r>
-        <w:t xml:space="preserve">, and take a normal reference. Table 1</w:t>
+      <w:r>
+        <w:rPr>
+          <w:iCs/>
+          <w:i/>
+        </w:rPr>
+        <w:t xml:space="preserve">G</w:t>
+      </w:r>
+      <w:r>
+        <w:t xml:space="preserve">/(</w:t>
+      </w:r>
+      <w:r>
+        <w:rPr>
+          <w:iCs/>
+          <w:i/>
+        </w:rPr>
+        <w:t xml:space="preserve">G</w:t>
+      </w:r>
+      <w:r>
+        <w:t xml:space="preserve"> </w:t>
+      </w:r>
+      <w:r>
+        <w:t xml:space="preserve">− 1), and take a normal reference. Table 1</w:t>
       </w:r>
       <w:r>
         <w:t xml:space="preserve"> </w:t>
@@ -3430,204 +3289,168 @@
       <w:r>
         <w:t xml:space="preserve"> </w:t>
       </w:r>
-      <m:oMath>
-        <m:r>
-          <m:t>G</m:t>
-        </m:r>
-        <m:r>
-          <m:rPr>
-            <m:sty m:val="p"/>
-          </m:rPr>
-          <m:t>−</m:t>
-        </m:r>
-        <m:r>
-          <m:t>1</m:t>
-        </m:r>
-      </m:oMath>
-      <w:r>
-        <w:t xml:space="preserve"> </w:t>
-      </w:r>
-      <w:r>
-        <w:t xml:space="preserve">degrees of freedom. Two-way clustering by date and stock follows Cameron et al. (2011), without the factor and with the variance bounded below at</w:t>
-      </w:r>
-      <w:r>
-        <w:t xml:space="preserve"> </w:t>
-      </w:r>
-      <m:oMath>
-        <m:sSup>
-          <m:e>
-            <m:r>
-              <m:t>10</m:t>
-            </m:r>
-          </m:e>
-          <m:sup>
-            <m:r>
-              <m:rPr>
-                <m:sty m:val="p"/>
-              </m:rPr>
-              <m:t>−</m:t>
-            </m:r>
-            <m:r>
-              <m:t>12</m:t>
-            </m:r>
-          </m:sup>
-        </m:sSup>
-      </m:oMath>
-      <w:r>
-        <w:t xml:space="preserve">. Table 3 reports</w:t>
-      </w:r>
-      <w:r>
-        <w:t xml:space="preserve"> </w:t>
-      </w:r>
-      <m:oMath>
-        <m:acc>
-          <m:accPr>
-            <m:chr m:val="̂"/>
-          </m:accPr>
-          <m:e>
-            <m:r>
-              <m:t>β</m:t>
-            </m:r>
-          </m:e>
-        </m:acc>
-      </m:oMath>
-      <w:r>
-        <w:t xml:space="preserve"> </w:t>
-      </w:r>
-      <w:r>
-        <w:t xml:space="preserve">from</w:t>
-      </w:r>
-      <w:r>
-        <w:t xml:space="preserve"> </w:t>
-      </w:r>
-      <m:oMath>
-        <m:sSub>
-          <m:e>
-            <m:r>
-              <m:t>y</m:t>
-            </m:r>
-          </m:e>
-          <m:sub>
-            <m:r>
-              <m:t>e</m:t>
-            </m:r>
-          </m:sub>
-        </m:sSub>
-        <m:r>
-          <m:rPr>
-            <m:sty m:val="p"/>
-          </m:rPr>
-          <m:t>=</m:t>
-        </m:r>
-        <m:r>
-          <m:t>α</m:t>
-        </m:r>
-        <m:r>
-          <m:rPr>
-            <m:sty m:val="p"/>
-          </m:rPr>
-          <m:t>+</m:t>
-        </m:r>
-        <m:r>
-          <m:t>β</m:t>
-        </m:r>
-        <m:sSub>
-          <m:e>
-            <m:r>
-              <m:t>D</m:t>
-            </m:r>
-          </m:e>
-          <m:sub>
-            <m:r>
-              <m:t>e</m:t>
-            </m:r>
-          </m:sub>
-        </m:sSub>
-        <m:r>
-          <m:rPr>
-            <m:sty m:val="p"/>
-          </m:rPr>
-          <m:t>+</m:t>
-        </m:r>
-        <m:sSub>
-          <m:e>
-            <m:r>
-              <m:t>u</m:t>
-            </m:r>
-          </m:e>
-          <m:sub>
-            <m:r>
-              <m:t>e</m:t>
-            </m:r>
-          </m:sub>
-        </m:sSub>
-      </m:oMath>
+      <w:r>
+        <w:rPr>
+          <w:iCs/>
+          <w:i/>
+        </w:rPr>
+        <w:t xml:space="preserve">G</w:t>
+      </w:r>
+      <w:r>
+        <w:t xml:space="preserve"> </w:t>
+      </w:r>
+      <w:r>
+        <w:t xml:space="preserve">− 1 degrees of freedom. The family</w:t>
+      </w:r>
+      <w:r>
+        <w:t xml:space="preserve"> </w:t>
+      </w:r>
+      <w:r>
+        <w:rPr>
+          <w:iCs/>
+          <w:i/>
+        </w:rPr>
+        <w:t xml:space="preserve">p</w:t>
+      </w:r>
+      <w:r>
+        <w:t xml:space="preserve">-values follow the analysis plan, which fixed the normal reference before any result was computed, so changing them after seeing the results would weaken the multiplicity control. Table 1 adds the small-sample factor and the</w:t>
+      </w:r>
+      <w:r>
+        <w:t xml:space="preserve"> </w:t>
+      </w:r>
+      <w:r>
+        <w:rPr>
+          <w:iCs/>
+          <w:i/>
+        </w:rPr>
+        <w:t xml:space="preserve">t</w:t>
+      </w:r>
+      <w:r>
+        <w:t xml:space="preserve"> </w:t>
+      </w:r>
+      <w:r>
+        <w:t xml:space="preserve">reference as a more conservative check. Under these settings, the four event tests still survive a Bonferroni correction in families of up to 683 tests (Section 3), so the choice does not change any conclusion. Two-way clustering by date and stock follows Cameron et al. (2011), without the factor and with the variance bounded below at 10</w:t>
+      </w:r>
+      <w:r>
+        <w:rPr>
+          <w:vertAlign w:val="superscript"/>
+        </w:rPr>
+        <w:t xml:space="preserve">−12</w:t>
+      </w:r>
+      <w:r>
+        <w:t xml:space="preserve">. Table 3 reports β̂ from</w:t>
+      </w:r>
+      <w:r>
+        <w:t xml:space="preserve"> </w:t>
+      </w:r>
+      <w:r>
+        <w:rPr>
+          <w:iCs/>
+          <w:i/>
+        </w:rPr>
+        <w:t xml:space="preserve">y</w:t>
+      </w:r>
+      <w:r>
+        <w:rPr>
+          <w:iCs/>
+          <w:i/>
+          <w:vertAlign w:val="subscript"/>
+        </w:rPr>
+        <w:t xml:space="preserve">e</w:t>
+      </w:r>
+      <w:r>
+        <w:t xml:space="preserve"> </w:t>
+      </w:r>
+      <w:r>
+        <w:t xml:space="preserve">= α + β</w:t>
+      </w:r>
+      <w:r>
+        <w:t xml:space="preserve"> </w:t>
+      </w:r>
+      <w:r>
+        <w:rPr>
+          <w:iCs/>
+          <w:i/>
+        </w:rPr>
+        <w:t xml:space="preserve">D</w:t>
+      </w:r>
+      <w:r>
+        <w:rPr>
+          <w:iCs/>
+          <w:i/>
+          <w:vertAlign w:val="subscript"/>
+        </w:rPr>
+        <w:t xml:space="preserve">e</w:t>
+      </w:r>
+      <w:r>
+        <w:t xml:space="preserve"> </w:t>
+      </w:r>
+      <w:r>
+        <w:t xml:space="preserve">+</w:t>
+      </w:r>
+      <w:r>
+        <w:t xml:space="preserve"> </w:t>
+      </w:r>
+      <w:r>
+        <w:rPr>
+          <w:iCs/>
+          <w:i/>
+        </w:rPr>
+        <w:t xml:space="preserve">u</w:t>
+      </w:r>
+      <w:r>
+        <w:rPr>
+          <w:iCs/>
+          <w:i/>
+          <w:vertAlign w:val="subscript"/>
+        </w:rPr>
+        <w:t xml:space="preserve">e</w:t>
+      </w:r>
       <w:r>
         <w:t xml:space="preserve">, where</w:t>
       </w:r>
       <w:r>
         <w:t xml:space="preserve"> </w:t>
       </w:r>
-      <m:oMath>
-        <m:sSub>
-          <m:e>
-            <m:r>
-              <m:t>D</m:t>
-            </m:r>
-          </m:e>
-          <m:sub>
-            <m:r>
-              <m:t>e</m:t>
-            </m:r>
-          </m:sub>
-        </m:sSub>
-        <m:r>
-          <m:rPr>
-            <m:sty m:val="p"/>
-          </m:rPr>
-          <m:t>=</m:t>
-        </m:r>
-        <m:r>
-          <m:t>1</m:t>
-        </m:r>
-      </m:oMath>
-      <w:r>
-        <w:t xml:space="preserve"> </w:t>
-      </w:r>
-      <w:r>
-        <w:t xml:space="preserve">for limit closes and 0 for the comparison moves,</w:t>
-      </w:r>
-      <w:r>
-        <w:t xml:space="preserve"> </w:t>
-      </w:r>
-      <m:oMath>
-        <m:r>
-          <m:t>α</m:t>
-        </m:r>
-      </m:oMath>
-      <w:r>
-        <w:t xml:space="preserve"> </w:t>
-      </w:r>
-      <w:r>
-        <w:t xml:space="preserve">is the intercept, and</w:t>
-      </w:r>
-      <w:r>
-        <w:t xml:space="preserve"> </w:t>
-      </w:r>
-      <m:oMath>
-        <m:sSub>
-          <m:e>
-            <m:r>
-              <m:t>u</m:t>
-            </m:r>
-          </m:e>
-          <m:sub>
-            <m:r>
-              <m:t>e</m:t>
-            </m:r>
-          </m:sub>
-        </m:sSub>
-      </m:oMath>
+      <w:r>
+        <w:rPr>
+          <w:iCs/>
+          <w:i/>
+        </w:rPr>
+        <w:t xml:space="preserve">D</w:t>
+      </w:r>
+      <w:r>
+        <w:rPr>
+          <w:iCs/>
+          <w:i/>
+          <w:vertAlign w:val="subscript"/>
+        </w:rPr>
+        <w:t xml:space="preserve">e</w:t>
+      </w:r>
+      <w:r>
+        <w:t xml:space="preserve"> </w:t>
+      </w:r>
+      <w:r>
+        <w:t xml:space="preserve">= 1 for limit closes and 0 for the comparison moves, α is the intercept, and</w:t>
+      </w:r>
+      <w:r>
+        <w:t xml:space="preserve"> </w:t>
+      </w:r>
+      <w:r>
+        <w:rPr>
+          <w:iCs/>
+          <w:i/>
+        </w:rPr>
+        <w:t xml:space="preserve">u</w:t>
+      </w:r>
+      <w:r>
+        <w:rPr>
+          <w:iCs/>
+          <w:i/>
+          <w:vertAlign w:val="subscript"/>
+        </w:rPr>
+        <w:t xml:space="preserve">e</w:t>
+      </w:r>
       <w:r>
         <w:t xml:space="preserve"> </w:t>
       </w:r>
@@ -3668,66 +3491,43 @@
       <w:r>
         <w:t xml:space="preserve"> </w:t>
       </w:r>
-      <m:oMath>
-        <m:r>
-          <m:t>T</m:t>
-        </m:r>
-        <m:r>
-          <m:rPr>
-            <m:sty m:val="p"/>
-          </m:rPr>
-          <m:t>=</m:t>
-        </m:r>
-        <m:r>
-          <m:t>79</m:t>
-        </m:r>
-      </m:oMath>
-      <w:r>
-        <w:t xml:space="preserve"> </w:t>
-      </w:r>
-      <w:r>
-        <w:t xml:space="preserve">formation weeks</w:t>
-      </w:r>
-      <w:r>
-        <w:t xml:space="preserve"> </w:t>
-      </w:r>
-      <m:oMath>
-        <m:r>
-          <m:t>τ</m:t>
-        </m:r>
-      </m:oMath>
-      <w:r>
-        <w:t xml:space="preserve"> </w:t>
-      </w:r>
-      <w:r>
-        <w:t xml:space="preserve">(five-trading-day periods, not the calendar weeks used for clustering), each followed by a non-overlapping five-day holding period. Each week, we rank-normalize each characteristic</w:t>
-      </w:r>
-      <w:r>
-        <w:t xml:space="preserve"> </w:t>
-      </w:r>
-      <m:oMath>
-        <m:sSub>
-          <m:e>
-            <m:r>
-              <m:t>x</m:t>
-            </m:r>
-          </m:e>
-          <m:sub>
-            <m:r>
-              <m:t>i</m:t>
-            </m:r>
-            <m:r>
-              <m:rPr>
-                <m:sty m:val="p"/>
-              </m:rPr>
-              <m:t>,</m:t>
-            </m:r>
-            <m:r>
-              <m:t>τ</m:t>
-            </m:r>
-          </m:sub>
-        </m:sSub>
-      </m:oMath>
+      <w:r>
+        <w:rPr>
+          <w:iCs/>
+          <w:i/>
+        </w:rPr>
+        <w:t xml:space="preserve">T</w:t>
+      </w:r>
+      <w:r>
+        <w:t xml:space="preserve"> </w:t>
+      </w:r>
+      <w:r>
+        <w:t xml:space="preserve">= 79 formation weeks τ (five-trading-day periods, not the calendar weeks used for clustering), each followed by a non-overlapping five-day holding period. Each week, we rank-normalize each characteristic</w:t>
+      </w:r>
+      <w:r>
+        <w:t xml:space="preserve"> </w:t>
+      </w:r>
+      <w:r>
+        <w:rPr>
+          <w:iCs/>
+          <w:i/>
+        </w:rPr>
+        <w:t xml:space="preserve">x</w:t>
+      </w:r>
+      <w:r>
+        <w:rPr>
+          <w:iCs/>
+          <w:i/>
+          <w:vertAlign w:val="subscript"/>
+        </w:rPr>
+        <w:t xml:space="preserve">i</w:t>
+      </w:r>
+      <w:r>
+        <w:rPr>
+          <w:vertAlign w:val="subscript"/>
+        </w:rPr>
+        <w:t xml:space="preserve">,τ</w:t>
+      </w:r>
       <w:r>
         <w:t xml:space="preserve"> </w:t>
       </w:r>
@@ -3737,20 +3537,19 @@
       <w:r>
         <w:t xml:space="preserve"> </w:t>
       </w:r>
-      <m:oMath>
-        <m:sSub>
-          <m:e>
-            <m:r>
-              <m:t>n</m:t>
-            </m:r>
-          </m:e>
-          <m:sub>
-            <m:r>
-              <m:t>τ</m:t>
-            </m:r>
-          </m:sub>
-        </m:sSub>
-      </m:oMath>
+      <w:r>
+        <w:rPr>
+          <w:iCs/>
+          <w:i/>
+        </w:rPr>
+        <w:t xml:space="preserve">n</w:t>
+      </w:r>
+      <w:r>
+        <w:rPr>
+          <w:vertAlign w:val="subscript"/>
+        </w:rPr>
+        <w:t xml:space="preserve">τ</w:t>
+      </w:r>
       <w:r>
         <w:t xml:space="preserve"> </w:t>
       </w:r>
@@ -3760,166 +3559,88 @@
       <w:r>
         <w:t xml:space="preserve"> </w:t>
       </w:r>
-      <m:oMath>
-        <m:sSub>
-          <m:e>
-            <m:r>
-              <m:t>z</m:t>
-            </m:r>
-          </m:e>
-          <m:sub>
-            <m:r>
-              <m:t>i</m:t>
-            </m:r>
-            <m:r>
-              <m:rPr>
-                <m:sty m:val="p"/>
-              </m:rPr>
-              <m:t>,</m:t>
-            </m:r>
-            <m:r>
-              <m:t>τ</m:t>
-            </m:r>
-          </m:sub>
-        </m:sSub>
-        <m:r>
-          <m:rPr>
-            <m:sty m:val="p"/>
-          </m:rPr>
-          <m:t>=</m:t>
-        </m:r>
-        <m:sSup>
-          <m:e>
-            <m:r>
-              <m:t>Φ</m:t>
-            </m:r>
-          </m:e>
-          <m:sup>
-            <m:r>
-              <m:rPr>
-                <m:sty m:val="p"/>
-              </m:rPr>
-              <m:t>−</m:t>
-            </m:r>
-            <m:r>
-              <m:t>1</m:t>
-            </m:r>
-          </m:sup>
-        </m:sSup>
-        <m:r>
-          <m:t>​</m:t>
-        </m:r>
-        <m:d>
-          <m:dPr>
-            <m:begChr m:val="("/>
-            <m:endChr m:val=")"/>
-            <m:sepChr m:val=""/>
-            <m:grow/>
-          </m:dPr>
-          <m:e>
-            <m:d>
-              <m:dPr>
-                <m:begChr m:val="("/>
-                <m:endChr m:val=")"/>
-                <m:sepChr m:val=""/>
-                <m:grow/>
-              </m:dPr>
-              <m:e>
-                <m:r>
-                  <m:rPr>
-                    <m:sty m:val="p"/>
-                  </m:rPr>
-                  <m:t>rank</m:t>
-                </m:r>
-                <m:d>
-                  <m:dPr>
-                    <m:begChr m:val="("/>
-                    <m:endChr m:val=")"/>
-                    <m:sepChr m:val=""/>
-                    <m:grow/>
-                  </m:dPr>
-                  <m:e>
-                    <m:sSub>
-                      <m:e>
-                        <m:r>
-                          <m:t>x</m:t>
-                        </m:r>
-                      </m:e>
-                      <m:sub>
-                        <m:r>
-                          <m:t>i</m:t>
-                        </m:r>
-                        <m:r>
-                          <m:rPr>
-                            <m:sty m:val="p"/>
-                          </m:rPr>
-                          <m:t>,</m:t>
-                        </m:r>
-                        <m:r>
-                          <m:t>τ</m:t>
-                        </m:r>
-                      </m:sub>
-                    </m:sSub>
-                  </m:e>
-                </m:d>
-                <m:r>
-                  <m:rPr>
-                    <m:sty m:val="p"/>
-                  </m:rPr>
-                  <m:t>−</m:t>
-                </m:r>
-                <m:r>
-                  <m:t>0.5</m:t>
-                </m:r>
-              </m:e>
-            </m:d>
-            <m:r>
-              <m:rPr>
-                <m:sty m:val="p"/>
-              </m:rPr>
-              <m:t>/</m:t>
-            </m:r>
-            <m:sSub>
-              <m:e>
-                <m:r>
-                  <m:t>n</m:t>
-                </m:r>
-              </m:e>
-              <m:sub>
-                <m:r>
-                  <m:t>τ</m:t>
-                </m:r>
-              </m:sub>
-            </m:sSub>
-          </m:e>
-        </m:d>
-      </m:oMath>
-      <w:r>
-        <w:t xml:space="preserve">, with ties at average ranks and</w:t>
-      </w:r>
-      <w:r>
-        <w:t xml:space="preserve"> </w:t>
-      </w:r>
-      <m:oMath>
-        <m:sSup>
-          <m:e>
-            <m:r>
-              <m:t>Φ</m:t>
-            </m:r>
-          </m:e>
-          <m:sup>
-            <m:r>
-              <m:rPr>
-                <m:sty m:val="p"/>
-              </m:rPr>
-              <m:t>−</m:t>
-            </m:r>
-            <m:r>
-              <m:t>1</m:t>
-            </m:r>
-          </m:sup>
-        </m:sSup>
-      </m:oMath>
+      <w:r>
+        <w:rPr>
+          <w:iCs/>
+          <w:i/>
+        </w:rPr>
+        <w:t xml:space="preserve">z</w:t>
+      </w:r>
+      <w:r>
+        <w:rPr>
+          <w:iCs/>
+          <w:i/>
+          <w:vertAlign w:val="subscript"/>
+        </w:rPr>
+        <w:t xml:space="preserve">i</w:t>
+      </w:r>
+      <w:r>
+        <w:rPr>
+          <w:vertAlign w:val="subscript"/>
+        </w:rPr>
+        <w:t xml:space="preserve">,τ</w:t>
+      </w:r>
+      <w:r>
+        <w:t xml:space="preserve"> </w:t>
+      </w:r>
+      <w:r>
+        <w:t xml:space="preserve">= Φ</w:t>
+      </w:r>
+      <w:r>
+        <w:rPr>
+          <w:vertAlign w:val="superscript"/>
+        </w:rPr>
+        <w:t xml:space="preserve">−1</w:t>
+      </w:r>
+      <w:r>
+        <w:t xml:space="preserve">((rank(</w:t>
+      </w:r>
+      <w:r>
+        <w:rPr>
+          <w:iCs/>
+          <w:i/>
+        </w:rPr>
+        <w:t xml:space="preserve">x</w:t>
+      </w:r>
+      <w:r>
+        <w:rPr>
+          <w:iCs/>
+          <w:i/>
+          <w:vertAlign w:val="subscript"/>
+        </w:rPr>
+        <w:t xml:space="preserve">i</w:t>
+      </w:r>
+      <w:r>
+        <w:rPr>
+          <w:vertAlign w:val="subscript"/>
+        </w:rPr>
+        <w:t xml:space="preserve">,τ</w:t>
+      </w:r>
+      <w:r>
+        <w:t xml:space="preserve">) − 0.5)/</w:t>
+      </w:r>
+      <w:r>
+        <w:rPr>
+          <w:iCs/>
+          <w:i/>
+        </w:rPr>
+        <w:t xml:space="preserve">n</w:t>
+      </w:r>
+      <w:r>
+        <w:rPr>
+          <w:vertAlign w:val="subscript"/>
+        </w:rPr>
+        <w:t xml:space="preserve">τ</w:t>
+      </w:r>
+      <w:r>
+        <w:t xml:space="preserve">), with ties at average ranks and Φ</w:t>
+      </w:r>
+      <w:r>
+        <w:rPr>
+          <w:vertAlign w:val="superscript"/>
+        </w:rPr>
+        <w:t xml:space="preserve">−1</w:t>
+      </w:r>
       <w:r>
         <w:t xml:space="preserve"> </w:t>
       </w:r>
@@ -3929,29 +3650,27 @@
       <w:r>
         <w:t xml:space="preserve"> </w:t>
       </w:r>
-      <m:oMath>
-        <m:sSub>
-          <m:e>
-            <m:r>
-              <m:t>y</m:t>
-            </m:r>
-          </m:e>
-          <m:sub>
-            <m:r>
-              <m:t>i</m:t>
-            </m:r>
-            <m:r>
-              <m:rPr>
-                <m:sty m:val="p"/>
-              </m:rPr>
-              <m:t>,</m:t>
-            </m:r>
-            <m:r>
-              <m:t>τ</m:t>
-            </m:r>
-          </m:sub>
-        </m:sSub>
-      </m:oMath>
+      <w:r>
+        <w:rPr>
+          <w:iCs/>
+          <w:i/>
+        </w:rPr>
+        <w:t xml:space="preserve">y</w:t>
+      </w:r>
+      <w:r>
+        <w:rPr>
+          <w:iCs/>
+          <w:i/>
+          <w:vertAlign w:val="subscript"/>
+        </w:rPr>
+        <w:t xml:space="preserve">i</w:t>
+      </w:r>
+      <w:r>
+        <w:rPr>
+          <w:vertAlign w:val="subscript"/>
+        </w:rPr>
+        <w:t xml:space="preserve">,τ</w:t>
+      </w:r>
       <w:r>
         <w:t xml:space="preserve"> </w:t>
       </w:r>
@@ -3961,18 +3680,13 @@
       <w:r>
         <w:t xml:space="preserve"> </w:t>
       </w:r>
-      <m:oMath>
-        <m:bar>
-          <m:barPr>
-            <m:pos m:val="top"/>
-          </m:barPr>
-          <m:e>
-            <m:r>
-              <m:t>V</m:t>
-            </m:r>
-          </m:e>
-        </m:bar>
-      </m:oMath>
+      <w:r>
+        <w:rPr>
+          <w:iCs/>
+          <w:i/>
+        </w:rPr>
+        <w:t xml:space="preserve">V̄</w:t>
+      </w:r>
       <w:r>
         <w:t xml:space="preserve">-weighted average five-day return of these stocks. The Fama and MacBeth (1973) regressions are</w:t>
       </w:r>
@@ -4182,22 +3896,6 @@
               </m:sSub>
             </m:e>
           </m:nary>
-          <m:r>
-            <m:rPr>
-              <m:sty m:val="p"/>
-            </m:rPr>
-            <m:t>,</m:t>
-          </m:r>
-          <m:r>
-            <m:t>  </m:t>
-          </m:r>
-          <m:r>
-            <m:rPr>
-              <m:nor/>
-              <m:sty m:val="p"/>
-            </m:rPr>
-            <m:t>(7)</m:t>
-          </m:r>
         </m:oMath>
       </m:oMathPara>
     </w:p>
@@ -4206,74 +3904,58 @@
         <w:pStyle w:val="FirstParagraph"/>
       </w:pPr>
       <w:r>
+        <w:t xml:space="preserve">[[EQNUM:7]]</w:t>
+      </w:r>
+    </w:p>
+    <w:p>
+      <w:pPr>
+        <w:pStyle w:val="BodyText"/>
+      </w:pPr>
+      <w:r>
         <w:t xml:space="preserve">with a weekly intercept</w:t>
       </w:r>
       <w:r>
         <w:t xml:space="preserve"> </w:t>
       </w:r>
-      <m:oMath>
-        <m:sSub>
-          <m:e>
-            <m:r>
-              <m:t>a</m:t>
-            </m:r>
-          </m:e>
-          <m:sub>
-            <m:r>
-              <m:t>τ</m:t>
-            </m:r>
-          </m:sub>
-        </m:sSub>
-      </m:oMath>
-      <w:r>
-        <w:t xml:space="preserve">, slope</w:t>
-      </w:r>
-      <w:r>
-        <w:t xml:space="preserve"> </w:t>
-      </w:r>
-      <m:oMath>
-        <m:sSub>
-          <m:e>
-            <m:r>
-              <m:t>γ</m:t>
-            </m:r>
-          </m:e>
-          <m:sub>
-            <m:r>
-              <m:t>τ</m:t>
-            </m:r>
-          </m:sub>
-        </m:sSub>
-      </m:oMath>
-      <w:r>
-        <w:t xml:space="preserve">, and residual</w:t>
-      </w:r>
-      <w:r>
-        <w:t xml:space="preserve"> </w:t>
-      </w:r>
-      <m:oMath>
-        <m:sSub>
-          <m:e>
-            <m:r>
-              <m:t>ε</m:t>
-            </m:r>
-          </m:e>
-          <m:sub>
-            <m:r>
-              <m:t>i</m:t>
-            </m:r>
-            <m:r>
-              <m:rPr>
-                <m:sty m:val="p"/>
-              </m:rPr>
-              <m:t>,</m:t>
-            </m:r>
-            <m:r>
-              <m:t>τ</m:t>
-            </m:r>
-          </m:sub>
-        </m:sSub>
-      </m:oMath>
+      <w:r>
+        <w:rPr>
+          <w:iCs/>
+          <w:i/>
+        </w:rPr>
+        <w:t xml:space="preserve">a</w:t>
+      </w:r>
+      <w:r>
+        <w:rPr>
+          <w:vertAlign w:val="subscript"/>
+        </w:rPr>
+        <w:t xml:space="preserve">τ</w:t>
+      </w:r>
+      <w:r>
+        <w:t xml:space="preserve">, slope γ</w:t>
+      </w:r>
+      <w:r>
+        <w:rPr>
+          <w:vertAlign w:val="subscript"/>
+        </w:rPr>
+        <w:t xml:space="preserve">τ</w:t>
+      </w:r>
+      <w:r>
+        <w:t xml:space="preserve">, and residual ε</w:t>
+      </w:r>
+      <w:r>
+        <w:rPr>
+          <w:iCs/>
+          <w:i/>
+          <w:vertAlign w:val="subscript"/>
+        </w:rPr>
+        <w:t xml:space="preserve">i</w:t>
+      </w:r>
+      <w:r>
+        <w:rPr>
+          <w:vertAlign w:val="subscript"/>
+        </w:rPr>
+        <w:t xml:space="preserve">,τ</w:t>
+      </w:r>
       <w:r>
         <w:t xml:space="preserve">. The</w:t>
       </w:r>
@@ -4288,179 +3970,7 @@
         <w:t xml:space="preserve">t</w:t>
       </w:r>
       <w:r>
-        <w:t xml:space="preserve">-statistic of</w:t>
-      </w:r>
-      <w:r>
-        <w:t xml:space="preserve"> </w:t>
-      </w:r>
-      <m:oMath>
-        <m:acc>
-          <m:accPr>
-            <m:chr m:val="̂"/>
-          </m:accPr>
-          <m:e>
-            <m:r>
-              <m:t>γ</m:t>
-            </m:r>
-          </m:e>
-        </m:acc>
-      </m:oMath>
-      <w:r>
-        <w:t xml:space="preserve"> </w:t>
-      </w:r>
-      <w:r>
-        <w:t xml:space="preserve">uses Newey and West’s (1987) standard errors (four lags, Bartlett weights, and no prewhitening) and 78 degrees of freedom. Supplementary Material S1 defines the 22 momentum, reversal, risk, liquidity, volume, and intraday characteristics. We also report long–short spreads between the extreme quintiles before and after a cost of 25 basis points per unit of traded value. The minimum detectable effect (MDE) at 80% power and a 5% two-sided level is</w:t>
-      </w:r>
-      <w:r>
-        <w:t xml:space="preserve"> </w:t>
-      </w:r>
-      <m:oMath>
-        <m:r>
-          <m:rPr>
-            <m:nor/>
-            <m:sty m:val="p"/>
-          </m:rPr>
-          <m:t>MDE</m:t>
-        </m:r>
-        <m:r>
-          <m:rPr>
-            <m:sty m:val="p"/>
-          </m:rPr>
-          <m:t>=</m:t>
-        </m:r>
-        <m:d>
-          <m:dPr>
-            <m:begChr m:val="("/>
-            <m:endChr m:val=")"/>
-            <m:sepChr m:val=""/>
-            <m:grow/>
-          </m:dPr>
-          <m:e>
-            <m:r>
-              <m:t>1.96</m:t>
-            </m:r>
-            <m:r>
-              <m:rPr>
-                <m:sty m:val="p"/>
-              </m:rPr>
-              <m:t>+</m:t>
-            </m:r>
-            <m:r>
-              <m:t>0.84</m:t>
-            </m:r>
-          </m:e>
-        </m:d>
-        <m:r>
-          <m:t> </m:t>
-        </m:r>
-        <m:acc>
-          <m:accPr>
-            <m:chr m:val="̂"/>
-          </m:accPr>
-          <m:e>
-            <m:r>
-              <m:rPr>
-                <m:nor/>
-                <m:sty m:val="p"/>
-              </m:rPr>
-              <m:t>SE</m:t>
-            </m:r>
-          </m:e>
-        </m:acc>
-        <m:d>
-          <m:dPr>
-            <m:begChr m:val="("/>
-            <m:endChr m:val=")"/>
-            <m:sepChr m:val=""/>
-            <m:grow/>
-          </m:dPr>
-          <m:e>
-            <m:acc>
-              <m:accPr>
-                <m:chr m:val="̂"/>
-              </m:accPr>
-              <m:e>
-                <m:r>
-                  <m:t>γ</m:t>
-                </m:r>
-              </m:e>
-            </m:acc>
-          </m:e>
-        </m:d>
-        <m:r>
-          <m:rPr>
-            <m:sty m:val="p"/>
-          </m:rPr>
-          <m:t>≈</m:t>
-        </m:r>
-        <m:r>
-          <m:t>2.8</m:t>
-        </m:r>
-        <m:r>
-          <m:t> </m:t>
-        </m:r>
-        <m:acc>
-          <m:accPr>
-            <m:chr m:val="̂"/>
-          </m:accPr>
-          <m:e>
-            <m:r>
-              <m:rPr>
-                <m:nor/>
-                <m:sty m:val="p"/>
-              </m:rPr>
-              <m:t>SE</m:t>
-            </m:r>
-          </m:e>
-        </m:acc>
-        <m:d>
-          <m:dPr>
-            <m:begChr m:val="("/>
-            <m:endChr m:val=")"/>
-            <m:sepChr m:val=""/>
-            <m:grow/>
-          </m:dPr>
-          <m:e>
-            <m:acc>
-              <m:accPr>
-                <m:chr m:val="̂"/>
-              </m:accPr>
-              <m:e>
-                <m:r>
-                  <m:t>γ</m:t>
-                </m:r>
-              </m:e>
-            </m:acc>
-          </m:e>
-        </m:d>
-      </m:oMath>
-      <w:r>
-        <w:t xml:space="preserve">, with</w:t>
-      </w:r>
-      <w:r>
-        <w:t xml:space="preserve"> </w:t>
-      </w:r>
-      <m:oMath>
-        <m:acc>
-          <m:accPr>
-            <m:chr m:val="̂"/>
-          </m:accPr>
-          <m:e>
-            <m:r>
-              <m:rPr>
-                <m:nor/>
-                <m:sty m:val="p"/>
-              </m:rPr>
-              <m:t>SE</m:t>
-            </m:r>
-          </m:e>
-        </m:acc>
-      </m:oMath>
-      <w:r>
-        <w:t xml:space="preserve"> </w:t>
-      </w:r>
-      <w:r>
-        <w:t xml:space="preserve">the Newey–West standard error.</w:t>
+        <w:t xml:space="preserve">-statistic of γ̂ uses Newey and West’s (1987) standard errors (four lags, Bartlett weights, and no prewhitening) and 78 degrees of freedom. Supplementary Material S1 defines the 22 momentum, reversal, risk, liquidity, volume, and intraday characteristics. We also report long–short spreads between the extreme quintiles before and after a cost of 25 basis points per unit of traded value. The minimum detectable effect (MDE) at 80% power and a 5% two-sided level is MDE = (1.96 + 0.84) ŜE(γ̂) ≈ 2.8 ŜE(γ̂), with ŜE the Newey–West standard error.</w:t>
       </w:r>
     </w:p>
     <w:p>
@@ -4483,25 +3993,18 @@
       <w:r>
         <w:t xml:space="preserve"> </w:t>
       </w:r>
-      <m:oMath>
-        <m:r>
-          <m:t>m</m:t>
-        </m:r>
-        <m:r>
-          <m:rPr>
-            <m:sty m:val="p"/>
-          </m:rPr>
-          <m:t>=</m:t>
-        </m:r>
-        <m:r>
-          <m:t>26</m:t>
-        </m:r>
-      </m:oMath>
-      <w:r>
-        <w:t xml:space="preserve"> </w:t>
-      </w:r>
-      <w:r>
-        <w:t xml:space="preserve">tests: 22 characteristics and the ceiling and floor tests at the two horizons of Equation (4). With</w:t>
+      <w:r>
+        <w:rPr>
+          <w:iCs/>
+          <w:i/>
+        </w:rPr>
+        <w:t xml:space="preserve">m</w:t>
+      </w:r>
+      <w:r>
+        <w:t xml:space="preserve"> </w:t>
+      </w:r>
+      <w:r>
+        <w:t xml:space="preserve">= 26 tests: 22 characteristics and the ceiling and floor tests at the two horizons of Equation (4). With</w:t>
       </w:r>
       <w:r>
         <w:t xml:space="preserve"> </w:t>
@@ -4519,70 +4022,55 @@
       <w:r>
         <w:t xml:space="preserve"> </w:t>
       </w:r>
-      <m:oMath>
-        <m:sSub>
-          <m:e>
-            <m:r>
-              <m:t>p</m:t>
-            </m:r>
-          </m:e>
-          <m:sub>
-            <m:d>
-              <m:dPr>
-                <m:begChr m:val="("/>
-                <m:endChr m:val=")"/>
-                <m:sepChr m:val=""/>
-                <m:grow/>
-              </m:dPr>
-              <m:e>
-                <m:r>
-                  <m:t>1</m:t>
-                </m:r>
-              </m:e>
-            </m:d>
-          </m:sub>
-        </m:sSub>
-        <m:r>
-          <m:rPr>
-            <m:sty m:val="p"/>
-          </m:rPr>
-          <m:t>≤</m:t>
-        </m:r>
-        <m:r>
-          <m:rPr>
-            <m:sty m:val="p"/>
-          </m:rPr>
-          <m:t>…</m:t>
-        </m:r>
-        <m:r>
-          <m:rPr>
-            <m:sty m:val="p"/>
-          </m:rPr>
-          <m:t>≤</m:t>
-        </m:r>
-        <m:sSub>
-          <m:e>
-            <m:r>
-              <m:t>p</m:t>
-            </m:r>
-          </m:e>
-          <m:sub>
-            <m:d>
-              <m:dPr>
-                <m:begChr m:val="("/>
-                <m:endChr m:val=")"/>
-                <m:sepChr m:val=""/>
-                <m:grow/>
-              </m:dPr>
-              <m:e>
-                <m:r>
-                  <m:t>m</m:t>
-                </m:r>
-              </m:e>
-            </m:d>
-          </m:sub>
-        </m:sSub>
-      </m:oMath>
+      <w:r>
+        <w:rPr>
+          <w:iCs/>
+          <w:i/>
+        </w:rPr>
+        <w:t xml:space="preserve">p</w:t>
+      </w:r>
+      <w:r>
+        <w:rPr>
+          <w:vertAlign w:val="subscript"/>
+        </w:rPr>
+        <w:t xml:space="preserve">(1)</w:t>
+      </w:r>
+      <w:r>
+        <w:t xml:space="preserve"> </w:t>
+      </w:r>
+      <w:r>
+        <w:t xml:space="preserve">≤ … ≤</w:t>
+      </w:r>
+      <w:r>
+        <w:t xml:space="preserve"> </w:t>
+      </w:r>
+      <w:r>
+        <w:rPr>
+          <w:iCs/>
+          <w:i/>
+        </w:rPr>
+        <w:t xml:space="preserve">p</w:t>
+      </w:r>
+      <w:r>
+        <w:rPr>
+          <w:vertAlign w:val="subscript"/>
+        </w:rPr>
+        <w:t xml:space="preserve">(</w:t>
+      </w:r>
+      <w:r>
+        <w:rPr>
+          <w:iCs/>
+          <w:i/>
+          <w:vertAlign w:val="subscript"/>
+        </w:rPr>
+        <w:t xml:space="preserve">m</w:t>
+      </w:r>
+      <w:r>
+        <w:rPr>
+          <w:vertAlign w:val="subscript"/>
+        </w:rPr>
+        <w:t xml:space="preserve">)</w:t>
+      </w:r>
       <w:r>
         <w:t xml:space="preserve">, the Benjamini–Hochberg (BH) adjusted</w:t>
       </w:r>
@@ -4602,11 +4090,13 @@
       <w:r>
         <w:t xml:space="preserve"> </w:t>
       </w:r>
-      <m:oMath>
-        <m:r>
-          <m:t>r</m:t>
-        </m:r>
-      </m:oMath>
+      <w:r>
+        <w:rPr>
+          <w:iCs/>
+          <w:i/>
+        </w:rPr>
+        <w:t xml:space="preserve">r</w:t>
+      </w:r>
       <w:r>
         <w:t xml:space="preserve"> </w:t>
       </w:r>
@@ -4760,22 +4250,6 @@
               </m:d>
             </m:e>
           </m:d>
-          <m:r>
-            <m:rPr>
-              <m:sty m:val="p"/>
-            </m:rPr>
-            <m:t>,</m:t>
-          </m:r>
-          <m:r>
-            <m:t>  </m:t>
-          </m:r>
-          <m:r>
-            <m:rPr>
-              <m:nor/>
-              <m:sty m:val="p"/>
-            </m:rPr>
-            <m:t>(8)</m:t>
-          </m:r>
         </m:oMath>
       </m:oMathPara>
     </w:p>
@@ -4784,6 +4258,14 @@
         <w:pStyle w:val="FirstParagraph"/>
       </w:pPr>
       <w:r>
+        <w:t xml:space="preserve">[[EQNUM:8]]</w:t>
+      </w:r>
+    </w:p>
+    <w:p>
+      <w:pPr>
+        <w:pStyle w:val="BodyText"/>
+      </w:pPr>
+      <w:r>
         <w:t xml:space="preserve">We also report Holm’s (1979) adjustments and the |</w:t>
       </w:r>
       <w:r>
@@ -4799,29 +4281,18 @@
       <w:r>
         <w:t xml:space="preserve"> </w:t>
       </w:r>
-      <m:oMath>
-        <m:acc>
-          <m:accPr>
-            <m:chr m:val="̃"/>
-          </m:accPr>
-          <m:e>
-            <m:r>
-              <m:t>p</m:t>
-            </m:r>
-          </m:e>
-        </m:acc>
-        <m:r>
-          <m:rPr>
-            <m:sty m:val="p"/>
-          </m:rPr>
-          <m:t>&lt;</m:t>
-        </m:r>
-        <m:r>
-          <m:t>0.05</m:t>
-        </m:r>
-      </m:oMath>
-      <w:r>
-        <w:t xml:space="preserve">, which controls the FDR at 5%; if its signs agree in the discovery half (the first 39 weeks or events up to the median event date) and the confirmation half; and if its confirmation-half |</w:t>
+      <w:r>
+        <w:rPr>
+          <w:iCs/>
+          <w:i/>
+        </w:rPr>
+        <w:t xml:space="preserve">p̃</w:t>
+      </w:r>
+      <w:r>
+        <w:t xml:space="preserve"> </w:t>
+      </w:r>
+      <w:r>
+        <w:t xml:space="preserve">&lt; 0.05, which controls the FDR at 5%; if its signs agree in the discovery half (the first 39 weeks or events up to the median event date) and the confirmation half; and if its confirmation-half |</w:t>
       </w:r>
       <w:r>
         <w:rPr>
@@ -4983,28 +4454,7 @@
         <w:t xml:space="preserve">t</w:t>
       </w:r>
       <w:r>
-        <w:t xml:space="preserve">-statistics of the 22 slopes</w:t>
-      </w:r>
-      <w:r>
-        <w:t xml:space="preserve"> </w:t>
-      </w:r>
-      <m:oMath>
-        <m:acc>
-          <m:accPr>
-            <m:chr m:val="̂"/>
-          </m:accPr>
-          <m:e>
-            <m:r>
-              <m:t>γ</m:t>
-            </m:r>
-          </m:e>
-        </m:acc>
-      </m:oMath>
-      <w:r>
-        <w:t xml:space="preserve"> </w:t>
-      </w:r>
-      <w:r>
-        <w:t xml:space="preserve">in Equation (7): none reaches |</w:t>
+        <w:t xml:space="preserve">-statistics of the 22 slopes γ̂ in Equation (7): none reaches |</w:t>
       </w:r>
       <w:r>
         <w:rPr>
@@ -5364,7 +4814,15 @@
         <w:t xml:space="preserve"> </w:t>
       </w:r>
       <w:r>
-        <w:t xml:space="preserve">= −4.6), and the intraday return is a weak reversal of 0.30%. The ceiling gap holds for exact limit hits (2.79%) and for the first day of a streak of exact hits (2.39%). Near hits show a smaller gap (1.67%) and no significant intraday return, but their median day-</w:t>
+        <w:t xml:space="preserve">= −4.6). The intraday return is a weak reversal of 0.30%.</w:t>
+      </w:r>
+    </w:p>
+    <w:p>
+      <w:pPr>
+        <w:pStyle w:val="BodyText"/>
+      </w:pPr>
+      <w:r>
+        <w:t xml:space="preserve">The ceiling gap holds for exact limit hits (2.79%) and for the first day of a streak of exact hits (2.39%). Near hits show a smaller gap (1.67%) and no significant intraday return. However, their median day-</w:t>
       </w:r>
       <w:r>
         <w:rPr>
@@ -5377,7 +4835,23 @@
         <w:t xml:space="preserve"> </w:t>
       </w:r>
       <w:r>
-        <w:t xml:space="preserve">return is 6.89% compared with 6.90% for exact hits, and 83% of their closes are not multiples of the tick size. This points to later price adjustment by the vendor rather than closing below the limit. Therefore, the split is weighted toward higher-priced stocks, where the tick is coarser, and we do not read the difference as a gradient toward the limit. The gap appears in both halves of the sample, on days locked at one price from open to close, and, for ceilings, in each tercile of the 60-day average dollar volume (1.52% in the most liquid). Against same-date controls, the ceiling gap is 2.70% and the floor close-to-close return is −1.65%, so the floor effect depends on the benchmark. Floor events cluster on market-wide down days (740 of 2,111 remain without days on which the market fell by more than 2%), and the floor gap is not significant in the least liquid tercile (</w:t>
+        <w:t xml:space="preserve">return is 6.89%, almost the same as the 6.90% of exact hits, and 83% of their closes are not multiples of the tick size. This points to later price adjustment by the vendor rather than to closes below the limit. The split is therefore weighted toward higher-priced stocks, where the tick is coarser, and we do not read the difference as a gradient toward the limit.</w:t>
+      </w:r>
+    </w:p>
+    <w:p>
+      <w:pPr>
+        <w:pStyle w:val="BodyText"/>
+      </w:pPr>
+      <w:r>
+        <w:t xml:space="preserve">The ceiling gap is robust across subsamples. It appears in both halves of the sample and on days locked at one price from open to close. It also appears in each tercile of the 60-day average dollar volume; in the most liquid tercile it is 1.52%. Against same-date controls, the ceiling gap is 2.70%.</w:t>
+      </w:r>
+    </w:p>
+    <w:p>
+      <w:pPr>
+        <w:pStyle w:val="BodyText"/>
+      </w:pPr>
+      <w:r>
+        <w:t xml:space="preserve">The floor effect is less robust. Against same-date controls, the floor close-to-close return is −1.65%, so its size depends on the benchmark. Floor events also cluster on market-wide down days: excluding days on which the market fell by more than 2% removes 1,371 of the 2,111 floor events. The floor gap is also not significant in the least liquid tercile (</w:t>
       </w:r>
       <w:r>
         <w:rPr>
@@ -5488,7 +4962,7 @@
         <w:t xml:space="preserve"> </w:t>
       </w:r>
       <w:r>
-        <w:t xml:space="preserve">= 14.0) and an intraday return 0.31 points lower. Floor closers have a gap 1.59 points lower than stocks that fell 5% to 6.5% (</w:t>
+        <w:t xml:space="preserve">= 14.0). Their intraday return is 0.31 points lower. Floor closers have a gap 1.59 points lower than stocks that fell 5% to 6.5% (</w:t>
       </w:r>
       <w:r>
         <w:rPr>
@@ -5501,7 +4975,15 @@
         <w:t xml:space="preserve"> </w:t>
       </w:r>
       <w:r>
-        <w:t xml:space="preserve">= −9.7). Because the event rule requires a close at the day’s high (low), we repeat the comparison with stocks that also closed at their high (low). The ceiling gap is then 3.14 points larger (</w:t>
+        <w:t xml:space="preserve">= −9.7).</w:t>
+      </w:r>
+    </w:p>
+    <w:p>
+      <w:pPr>
+        <w:pStyle w:val="BodyText"/>
+      </w:pPr>
+      <w:r>
+        <w:t xml:space="preserve">Because the event rule requires a close at the day’s high (low), we repeat the comparison with stocks that also closed at their high (low). The ceiling gap is then 3.14 points larger (</w:t>
       </w:r>
       <w:r>
         <w:rPr>
@@ -5514,7 +4996,7 @@
         <w:t xml:space="preserve"> </w:t>
       </w:r>
       <w:r>
-        <w:t xml:space="preserve">= 14.5) and the floor gap 1.81 points lower, so a strong close does not explain the contrast, which supports H</w:t>
+        <w:t xml:space="preserve">= 14.5), and the floor gap is 1.81 points lower. A strong close therefore does not explain the contrast, which supports H</w:t>
       </w:r>
       <w:r>
         <w:rPr>
@@ -5523,7 +5005,7 @@
         <w:t xml:space="preserve">3</w:t>
       </w:r>
       <w:r>
-        <w:t xml:space="preserve">. Against 3% to 5% moves, the ceiling gap is 2.40 percentage points larger and the floor gap 1.14 points lower. The comparison is an association around a rule-based threshold, and we make no regression-discontinuity claim: the design has no bandwidth choice, manipulation test, or covariate-balance check, and stocks that reach the limit may differ in news content.</w:t>
+        <w:t xml:space="preserve">. The contrast is smaller against 3% to 5% moves: 2.40 percentage points for ceilings and 1.14 points for floors. The comparison is an association around a rule-based threshold, and we make no regression-discontinuity claim. The design has no bandwidth choice, manipulation test, or covariate-balance check, and stocks that reach the limit may differ in news content.</w:t>
       </w:r>
     </w:p>
     <w:p>
@@ -5607,7 +5089,7 @@
         <w:pStyle w:val="BodyText"/>
       </w:pPr>
       <w:r>
-        <w:t xml:space="preserve">The ceiling gap, followed by an intraday reversal, appears in both periods (1.65% before and 2.49% after; difference</w:t>
+        <w:t xml:space="preserve">The ceiling gap, followed by an intraday reversal, appears in both periods: 1.65% before and 2.49% after (difference</w:t>
       </w:r>
       <w:r>
         <w:t xml:space="preserve"> </w:t>
@@ -5623,7 +5105,7 @@
         <w:t xml:space="preserve"> </w:t>
       </w:r>
       <w:r>
-        <w:t xml:space="preserve">= 1.6). The floor gap is more negative after the move (−0.42% before, −1.37% after; difference</w:t>
+        <w:t xml:space="preserve">= 1.6). The floor gap is more negative after the move, at −0.42% before and −1.37% after (difference</w:t>
       </w:r>
       <w:r>
         <w:t xml:space="preserve"> </w:t>
@@ -5639,7 +5121,7 @@
         <w:t xml:space="preserve"> </w:t>
       </w:r>
       <w:r>
-        <w:t xml:space="preserve">= −3.2), the intraday return after floor closes turns positive (0.64%), and the floor drift from the next open to day</w:t>
+        <w:t xml:space="preserve">= −3.2). After the move, the intraday return after floor closes turns positive (0.64%). The floor drift from the next open to day</w:t>
       </w:r>
       <w:r>
         <w:t xml:space="preserve"> </w:t>
@@ -5652,7 +5134,15 @@
         <w:t xml:space="preserve">d</w:t>
       </w:r>
       <w:r>
-        <w:t xml:space="preserve">+5 exists only before the move (−1.73% before, −0.15% after). The change coincides with a different market period, and the post-change sample accounts for 71% of the ceiling events and 58% of the floor events. Before the change, neither the ceiling close-to-close return (</w:t>
+        <w:t xml:space="preserve">+5 exists only before the move (−1.73% before and −0.15% after).</w:t>
+      </w:r>
+    </w:p>
+    <w:p>
+      <w:pPr>
+        <w:pStyle w:val="BodyText"/>
+      </w:pPr>
+      <w:r>
+        <w:t xml:space="preserve">The change coincides with a different market period. The post-change sample accounts for 71% of the ceiling events and 58% of the floor events. Before the change, neither the ceiling close-to-close return (</w:t>
       </w:r>
       <w:r>
         <w:rPr>
@@ -5678,7 +5168,7 @@
         <w:t xml:space="preserve"> </w:t>
       </w:r>
       <w:r>
-        <w:t xml:space="preserve">= −1.9) is significant at the 5% level, so the full-sample significance rests mainly on post-change events. We cannot attribute the differences between the periods to the auction rules.</w:t>
+        <w:t xml:space="preserve">= −1.9) is significant at the 5% level. The full-sample significance of these two measures therefore rests mainly on post-change events. We cannot attribute the differences between the periods to the auction rules.</w:t>
       </w:r>
     </w:p>
     <w:p>
@@ -5699,7 +5189,15 @@
         <w:t xml:space="preserve"> </w:t>
       </w:r>
       <w:r>
-        <w:t xml:space="preserve">from 2.5 to 16.8); its weakest quarter, 2025-Q2, contains the platform change. The floor gap is negative in every quarter and significant at the 5% level in seven of them. Placebo break dates on the first trading day of each month from January 2025 to April 2026 give ceiling-gap differences between −0.45 and 0.72 percentage points (|</w:t>
+        <w:t xml:space="preserve">from 2.5 to 16.8). Its weakest quarter, 2025-Q2, contains the platform change. The floor gap is negative in every quarter and significant at the 5% level in seven of them.</w:t>
+      </w:r>
+    </w:p>
+    <w:p>
+      <w:pPr>
+        <w:pStyle w:val="BodyText"/>
+      </w:pPr>
+      <w:r>
+        <w:t xml:space="preserve">We also move the break date to the first trading day of each month from January 2025 to April 2026. These placebo dates give ceiling-gap differences between −0.45 and 0.72 percentage points, all with |</w:t>
       </w:r>
       <w:r>
         <w:rPr>
@@ -5709,7 +5207,7 @@
         <w:t xml:space="preserve">t</w:t>
       </w:r>
       <w:r>
-        <w:t xml:space="preserve">| at most 1.4); the split at May 5, 2025, gives the largest difference, 0.85 points, but it is not significant either (</w:t>
+        <w:t xml:space="preserve">| of at most 1.4. The split at May 5, 2025, gives the largest difference, 0.85 points, but it is not significant either (</w:t>
       </w:r>
       <w:r>
         <w:rPr>
@@ -5722,7 +5220,7 @@
         <w:t xml:space="preserve"> </w:t>
       </w:r>
       <w:r>
-        <w:t xml:space="preserve">= 1.6). The floor-gap difference is positive at the four placebo dates before the platform change and negative at 11 of the 11 later ones, and the split at May 5, 2025, gives −0.95 points (</w:t>
+        <w:t xml:space="preserve">= 1.6). For floors, the difference is positive at the four placebo dates before the platform change and negative at 11 of the 11 later ones. The split at May 5, 2025, gives −0.95 points (</w:t>
       </w:r>
       <w:r>
         <w:rPr>
@@ -5735,7 +5233,15 @@
         <w:t xml:space="preserve"> </w:t>
       </w:r>
       <w:r>
-        <w:t xml:space="preserve">= −3.2), close to the differences at the placebo dates that follow it. Table 5 shows no trend in the floor gap; the pattern coincides with the weak floor gap in 2025-Q2 (−0.34%), the quarter with the most floor events (802). Therefore, the placebo dates cannot separate a break at the platform change from a shift specific to that quarter. A difference-in-differences regression that compares limit closes with 5–6.5% movers that also closed at the extreme points the same way for the ceiling (repository table C31): the excess ceiling gap was 2.91 percentage points before the change (</w:t>
+        <w:t xml:space="preserve">= −3.2), close to the placebo dates that follow it. Table 5 shows no trend in the floor gap, but the floor gap is weak in 2025-Q2 (−0.34%), the quarter with the most floor events (802). The placebo dates therefore cannot separate a break at the platform change from a shift specific to that quarter.</w:t>
+      </w:r>
+    </w:p>
+    <w:p>
+      <w:pPr>
+        <w:pStyle w:val="BodyText"/>
+      </w:pPr>
+      <w:r>
+        <w:t xml:space="preserve">A difference-in-differences regression compares limit closes with 5–6.5% movers that also closed at the extreme (repository table C31). For ceilings, the excess gap was 2.91 percentage points before the change (</w:t>
       </w:r>
       <w:r>
         <w:rPr>
@@ -5761,7 +5267,7 @@
         <w:t xml:space="preserve"> </w:t>
       </w:r>
       <w:r>
-        <w:t xml:space="preserve">= 0.8), and the excess floor gap was −1.62 points before (</w:t>
+        <w:t xml:space="preserve">= 0.8). For floors, the excess gap was −1.62 points before (</w:t>
       </w:r>
       <w:r>
         <w:rPr>
@@ -5808,24 +5314,19 @@
       <w:r>
         <w:t xml:space="preserve"> </w:t>
       </w:r>
-      <m:oMath>
-        <m:sSub>
-          <m:e>
-            <m:r>
-              <m:t>p</m:t>
-            </m:r>
-          </m:e>
-          <m:sub>
-            <m:r>
-              <m:rPr>
-                <m:nor/>
-                <m:sty m:val="p"/>
-              </m:rPr>
-              <m:t>max</m:t>
-            </m:r>
-          </m:sub>
-        </m:sSub>
-      </m:oMath>
+      <w:r>
+        <w:rPr>
+          <w:iCs/>
+          <w:i/>
+        </w:rPr>
+        <w:t xml:space="preserve">p</w:t>
+      </w:r>
+      <w:r>
+        <w:rPr>
+          <w:vertAlign w:val="subscript"/>
+        </w:rPr>
+        <w:t xml:space="preserve">max</w:t>
+      </w:r>
       <w:r>
         <w:t xml:space="preserve"> </w:t>
       </w:r>
@@ -5848,44 +5349,28 @@
       <w:r>
         <w:t xml:space="preserve"> </w:t>
       </w:r>
-      <m:oMath>
-        <m:r>
-          <m:t>G</m:t>
-        </m:r>
-        <m:r>
-          <m:rPr>
-            <m:sty m:val="p"/>
-          </m:rPr>
-          <m:t>/</m:t>
-        </m:r>
-        <m:d>
-          <m:dPr>
-            <m:begChr m:val="("/>
-            <m:endChr m:val=")"/>
-            <m:sepChr m:val=""/>
-            <m:grow/>
-          </m:dPr>
-          <m:e>
-            <m:r>
-              <m:t>G</m:t>
-            </m:r>
-            <m:r>
-              <m:rPr>
-                <m:sty m:val="p"/>
-              </m:rPr>
-              <m:t>−</m:t>
-            </m:r>
-            <m:r>
-              <m:t>1</m:t>
-            </m:r>
-          </m:e>
-        </m:d>
-      </m:oMath>
-      <w:r>
-        <w:t xml:space="preserve"> </w:t>
-      </w:r>
-      <w:r>
-        <w:t xml:space="preserve">and a</w:t>
+      <w:r>
+        <w:rPr>
+          <w:iCs/>
+          <w:i/>
+        </w:rPr>
+        <w:t xml:space="preserve">G</w:t>
+      </w:r>
+      <w:r>
+        <w:t xml:space="preserve">/(</w:t>
+      </w:r>
+      <w:r>
+        <w:rPr>
+          <w:iCs/>
+          <w:i/>
+        </w:rPr>
+        <w:t xml:space="preserve">G</w:t>
+      </w:r>
+      <w:r>
+        <w:t xml:space="preserve"> </w:t>
+      </w:r>
+      <w:r>
+        <w:t xml:space="preserve">− 1) and a</w:t>
       </w:r>
       <w:r>
         <w:t xml:space="preserve"> </w:t>
@@ -5906,91 +5391,60 @@
       <w:r>
         <w:t xml:space="preserve"> </w:t>
       </w:r>
-      <m:oMath>
-        <m:sSub>
-          <m:e>
-            <m:r>
-              <m:t>m</m:t>
-            </m:r>
-          </m:e>
-          <m:sub>
-            <m:r>
-              <m:rPr>
-                <m:nor/>
-                <m:sty m:val="p"/>
-              </m:rPr>
-              <m:t>max</m:t>
-            </m:r>
-          </m:sub>
-        </m:sSub>
-        <m:r>
-          <m:rPr>
-            <m:sty m:val="p"/>
-          </m:rPr>
-          <m:t>=</m:t>
-        </m:r>
-        <m:r>
-          <m:rPr>
-            <m:sty m:val="p"/>
-          </m:rPr>
-          <m:t>⌊</m:t>
-        </m:r>
-        <m:r>
-          <m:t>0.05</m:t>
-        </m:r>
-        <m:r>
-          <m:rPr>
-            <m:sty m:val="p"/>
-          </m:rPr>
-          <m:t>/</m:t>
-        </m:r>
-        <m:sSub>
-          <m:e>
-            <m:r>
-              <m:t>p</m:t>
-            </m:r>
-          </m:e>
-          <m:sub>
-            <m:r>
-              <m:rPr>
-                <m:nor/>
-                <m:sty m:val="p"/>
-              </m:rPr>
-              <m:t>max</m:t>
-            </m:r>
-          </m:sub>
-        </m:sSub>
-        <m:r>
-          <m:rPr>
-            <m:sty m:val="p"/>
-          </m:rPr>
-          <m:t>⌋</m:t>
-        </m:r>
-      </m:oMath>
-      <w:r>
-        <w:t xml:space="preserve"> </w:t>
-      </w:r>
-      <w:r>
-        <w:t xml:space="preserve">tests: 683 with date clusters and 125 with calendar-week clusters (</w:t>
-      </w:r>
-      <m:oMath>
-        <m:sSub>
-          <m:e>
-            <m:r>
-              <m:t>p</m:t>
-            </m:r>
-          </m:e>
-          <m:sub>
-            <m:r>
-              <m:rPr>
-                <m:nor/>
-                <m:sty m:val="p"/>
-              </m:rPr>
-              <m:t>max</m:t>
-            </m:r>
-          </m:sub>
-        </m:sSub>
-      </m:oMath>
+      <w:r>
+        <w:rPr>
+          <w:iCs/>
+          <w:i/>
+        </w:rPr>
+        <w:t xml:space="preserve">m</w:t>
+      </w:r>
+      <w:r>
+        <w:rPr>
+          <w:vertAlign w:val="subscript"/>
+        </w:rPr>
+        <w:t xml:space="preserve">max</w:t>
+      </w:r>
+      <w:r>
+        <w:t xml:space="preserve"> </w:t>
+      </w:r>
+      <w:r>
+        <w:t xml:space="preserve">= ⌊ 0.05 /</w:t>
+      </w:r>
+      <w:r>
+        <w:t xml:space="preserve"> </w:t>
+      </w:r>
+      <w:r>
+        <w:rPr>
+          <w:iCs/>
+          <w:i/>
+        </w:rPr>
+        <w:t xml:space="preserve">p</w:t>
+      </w:r>
+      <w:r>
+        <w:rPr>
+          <w:vertAlign w:val="subscript"/>
+        </w:rPr>
+        <w:t xml:space="preserve">max</w:t>
+      </w:r>
+      <w:r>
+        <w:t xml:space="preserve"> </w:t>
+      </w:r>
+      <w:r>
+        <w:t xml:space="preserve">⌋ tests: 683 with date clusters and 125 with calendar-week clusters (</w:t>
+      </w:r>
+      <w:r>
+        <w:rPr>
+          <w:iCs/>
+          <w:i/>
+        </w:rPr>
+        <w:t xml:space="preserve">p</w:t>
+      </w:r>
+      <w:r>
+        <w:rPr>
+          <w:vertAlign w:val="subscript"/>
+        </w:rPr>
+        <w:t xml:space="preserve">max</w:t>
+      </w:r>
       <w:r>
         <w:t xml:space="preserve"> </w:t>
       </w:r>
@@ -6129,7 +5583,7 @@
         <w:pStyle w:val="BodyText"/>
       </w:pPr>
       <w:r>
-        <w:t xml:space="preserve">None of the studies identified by our search (Supplementary Material S1) reports the next-day abnormal return, overnight gap, or intraday return after a limit close in a form that matches ours, so Table 6 compares signs, timing, and mechanism.</w:t>
+        <w:t xml:space="preserve">The earlier studies measure different outcomes and horizons, so Table 6 compares signs, timing, and mechanisms rather than magnitudes.</w:t>
       </w:r>
     </w:p>
     <w:p>
@@ -6158,7 +5612,7 @@
         <w:pStyle w:val="BodyText"/>
       </w:pPr>
       <w:r>
-        <w:t xml:space="preserve">The volume and prior-return results also fit an attention channel in which the limit amplifies demand: a stock at its ceiling may appear on screens and rankings the next morning, and a queue at the limit may signal excess demand. With noise traders overnight, arbitrageurs by day, and market makers absorbing retail imbalances near the open (Akbas et al., 2022; Lu et al., 2023), a limit would add a visible, rule-based trigger to an attention mechanism that operates without limits.</w:t>
+        <w:t xml:space="preserve">The volume and prior-return results also fit an attention channel in which the limit amplifies demand: a stock at its ceiling may appear on screens and rankings the next morning, and a queue at the limit may signal excess demand.</w:t>
       </w:r>
     </w:p>
     <w:p>
@@ -6180,14 +5634,10 @@
     </w:p>
     <w:p>
       <w:pPr>
-        <w:numPr>
-          <w:ilvl w:val="0"/>
-          <w:numId w:val="1001"/>
-        </w:numPr>
-        <w:pStyle w:val="Compact"/>
-      </w:pPr>
-      <w:r>
-        <w:t xml:space="preserve">The sample covers 519 trading days on one exchange, with one platform change and a period of market stress. (ii) Without order-book, investor-type, announcement, or news data, we infer the unfilled-demand mechanism and cannot separate it from selection on news. (iii) The 7% band, reference price, and platform change come from brokerage and press descriptions, checked against returns but not against exchange circulars; tick sizes, reference prices on corporate-action days, and wider bands for first-day listings and resumed trading are assumptions. (iv) The vendor appears to adjust earlier prices for later corporate actions. For stocks priced at 10 thousand dong or more, 25%, 31%, and 58% of 2024, 2025, and 2026 closes are tick multiples, against 100% below 10 thousand dong (an uninformative check, since the 0.01 tick equals the two-decimal resolution of the files), and near hits make up 62% of ceiling events for the higher-priced stocks against 23% for the others. Proportional adjustment leaves returns (except on ex-dates), the close-at-high rule, and locked days unchanged but makes the exact-hit classification of Equation (3) unreliable, so we treat that split as a data check, not a measure of distance to the limit. The listing snapshot excludes stocks delisted before the download. (v) Events in one market episode may depend on each other beyond our clustering, and we computed no calendar-time portfolio estimates or standard errors robust to both cross-sectional and serial dependence. (vi) Several characteristics (5-day return, largest and smallest daily returns, move frequency, and overnight return) share inputs with the event definition, and the Corwin–Schultz spread and range volatility use limit-censored highs and lows. (vii) The floor effect depends on the benchmark, and we built no beta- and size-matched control for the five-day outcome. (viii) The characteristic tests have limited power, and effect sizes may carry winner’s-curse bias from choosing this question among several screened on the same data.</w:t>
+        <w:pStyle w:val="FirstParagraph"/>
+      </w:pPr>
+      <w:r>
+        <w:t xml:space="preserve">(i) The sample covers 519 trading days on one exchange, with one platform change and a period of market stress. (ii) Without order-book, investor-type, announcement, or news data, we infer the unfilled-demand mechanism and cannot separate it from selection on news. (iii) The 7% band, reference price, and platform change come from brokerage and press descriptions, checked against returns but not against exchange circulars; tick sizes, reference prices on corporate-action days, and wider bands for first-day listings and resumed trading are assumptions. (iv) The vendor appears to adjust earlier prices for later corporate actions. For stocks priced at 10 thousand dong or more, only 25% to 58% of closes are tick multiples, and near hits make up 62% of ceiling events for the higher-priced stocks against 23% for the others. Proportional adjustment leaves returns (except on ex-dates), the close-at-high rule, and locked days unchanged but makes the exact-hit classification of Equation (3) unreliable, so we treat that split as a data check, not a measure of distance to the limit. The listing snapshot excludes stocks delisted before the download. (v) Events in one market episode may depend on each other beyond our clustering, and we computed no calendar-time portfolio estimates or standard errors robust to both cross-sectional and serial dependence. (vi) Several characteristics (5-day return, largest and smallest daily returns, move frequency, and overnight return) share inputs with the event definition, and the Corwin–Schultz spread and range volatility use limit-censored highs and lows. (vii) The floor effect depends on the benchmark, and we built no beta- and size-matched control for the five-day outcome. (viii) The characteristic tests have limited power, and effect sizes may carry winner’s-curse bias from choosing this question among several screened on the same data.</w:t>
       </w:r>
     </w:p>
     <w:bookmarkEnd w:id="26"/>
@@ -6345,7 +5795,7 @@
     </w:p>
     <w:bookmarkEnd w:id="35"/>
     <w:bookmarkEnd w:id="36"/>
-    <w:bookmarkStart w:id="65" w:name="references"/>
+    <w:bookmarkStart w:id="67" w:name="references"/>
     <w:p>
       <w:pPr>
         <w:pStyle w:val="Heading1"/>
@@ -6444,20 +5894,20 @@
         <w:pStyle w:val="BodyText"/>
       </w:pPr>
       <w:r>
-        <w:t xml:space="preserve">Berkman, H., Koch, P. D., Tuttle, L., &amp; Zhang, Y. J. (2012). Paying attention: Overnight returns and the hidden cost of buying at the open.</w:t>
-      </w:r>
-      <w:r>
-        <w:t xml:space="preserve"> </w:t>
-      </w:r>
-      <w:r>
-        <w:rPr>
-          <w:iCs/>
-          <w:i/>
-        </w:rPr>
-        <w:t xml:space="preserve">Journal of Financial and Quantitative Analysis, 47</w:t>
-      </w:r>
-      <w:r>
-        <w:t xml:space="preserve">(4), 715–741.</w:t>
+        <w:t xml:space="preserve">Berkman, H., &amp; Lee, J. B. T. (2002). The effectiveness of price limits in an emerging market: Evidence from the Korean Stock Exchange.</w:t>
+      </w:r>
+      <w:r>
+        <w:t xml:space="preserve"> </w:t>
+      </w:r>
+      <w:r>
+        <w:rPr>
+          <w:iCs/>
+          <w:i/>
+        </w:rPr>
+        <w:t xml:space="preserve">Pacific-Basin Finance Journal, 10</w:t>
+      </w:r>
+      <w:r>
+        <w:t xml:space="preserve">(5), 517–530.</w:t>
       </w:r>
       <w:r>
         <w:t xml:space="preserve"> </w:t>
@@ -6467,7 +5917,7 @@
           <w:rPr>
             <w:rStyle w:val="Hyperlink"/>
           </w:rPr>
-          <w:t xml:space="preserve">https://doi.org/10.1017/S0022109012000270</w:t>
+          <w:t xml:space="preserve">https://doi.org/10.1016/S0927-538X(02)00040-9</w:t>
         </w:r>
       </w:hyperlink>
     </w:p>
@@ -6476,20 +5926,20 @@
         <w:pStyle w:val="BodyText"/>
       </w:pPr>
       <w:r>
-        <w:t xml:space="preserve">Berkman, H., &amp; Lee, J. B. T. (2002). The effectiveness of price limits in an emerging market: Evidence from the Korean Stock Exchange.</w:t>
-      </w:r>
-      <w:r>
-        <w:t xml:space="preserve"> </w:t>
-      </w:r>
-      <w:r>
-        <w:rPr>
-          <w:iCs/>
-          <w:i/>
-        </w:rPr>
-        <w:t xml:space="preserve">Pacific-Basin Finance Journal, 10</w:t>
-      </w:r>
-      <w:r>
-        <w:t xml:space="preserve">(5), 517–530.</w:t>
+        <w:t xml:space="preserve">Berkman, H., Koch, P. D., Tuttle, L., &amp; Zhang, Y. J. (2012). Paying attention: Overnight returns and the hidden cost of buying at the open.</w:t>
+      </w:r>
+      <w:r>
+        <w:t xml:space="preserve"> </w:t>
+      </w:r>
+      <w:r>
+        <w:rPr>
+          <w:iCs/>
+          <w:i/>
+        </w:rPr>
+        <w:t xml:space="preserve">Journal of Financial and Quantitative Analysis, 47</w:t>
+      </w:r>
+      <w:r>
+        <w:t xml:space="preserve">(4), 715–741.</w:t>
       </w:r>
       <w:r>
         <w:t xml:space="preserve"> </w:t>
@@ -6499,7 +5949,7 @@
           <w:rPr>
             <w:rStyle w:val="Hyperlink"/>
           </w:rPr>
-          <w:t xml:space="preserve">https://doi.org/10.1016/S0927-538X(02)00040-9</w:t>
+          <w:t xml:space="preserve">https://doi.org/10.1017/S0022109012000270</w:t>
         </w:r>
       </w:hyperlink>
     </w:p>
@@ -6827,6 +6277,41 @@
         <w:pStyle w:val="BodyText"/>
       </w:pPr>
       <w:r>
+        <w:t xml:space="preserve">Farber, A., Nguyen, V. N., &amp; Vuong, Q. H. (2006).</w:t>
+      </w:r>
+      <w:r>
+        <w:t xml:space="preserve"> </w:t>
+      </w:r>
+      <w:r>
+        <w:rPr>
+          <w:iCs/>
+          <w:i/>
+        </w:rPr>
+        <w:t xml:space="preserve">Policy impacts on Vietnam stock market: A case of anomalies and disequilibria 2000–2006</w:t>
+      </w:r>
+      <w:r>
+        <w:t xml:space="preserve"> </w:t>
+      </w:r>
+      <w:r>
+        <w:t xml:space="preserve">(CEB Working Paper No. 06/005). Université Libre de Bruxelles.</w:t>
+      </w:r>
+      <w:r>
+        <w:t xml:space="preserve"> </w:t>
+      </w:r>
+      <w:hyperlink r:id="rId49">
+        <w:r>
+          <w:rPr>
+            <w:rStyle w:val="Hyperlink"/>
+          </w:rPr>
+          <w:t xml:space="preserve">https://ideas.repec.org/p/sol/wpaper/06-005.html</w:t>
+        </w:r>
+      </w:hyperlink>
+    </w:p>
+    <w:p>
+      <w:pPr>
+        <w:pStyle w:val="BodyText"/>
+      </w:pPr>
+      <w:r>
         <w:t xml:space="preserve">Greenwald, B. C., &amp; Stein, J. C. (1991). Transactional risk, market crashes, and the role of circuit breakers.</w:t>
       </w:r>
       <w:r>
@@ -6866,7 +6351,7 @@
       <w:r>
         <w:t xml:space="preserve"> </w:t>
       </w:r>
-      <w:hyperlink r:id="rId49">
+      <w:hyperlink r:id="rId50">
         <w:r>
           <w:rPr>
             <w:rStyle w:val="Hyperlink"/>
@@ -6898,7 +6383,7 @@
       <w:r>
         <w:t xml:space="preserve"> </w:t>
       </w:r>
-      <w:hyperlink r:id="rId50">
+      <w:hyperlink r:id="rId51">
         <w:r>
           <w:rPr>
             <w:rStyle w:val="Hyperlink"/>
@@ -6930,7 +6415,7 @@
       <w:r>
         <w:t xml:space="preserve"> </w:t>
       </w:r>
-      <w:hyperlink r:id="rId51">
+      <w:hyperlink r:id="rId52">
         <w:r>
           <w:rPr>
             <w:rStyle w:val="Hyperlink"/>
@@ -6962,7 +6447,7 @@
       <w:r>
         <w:t xml:space="preserve"> </w:t>
       </w:r>
-      <w:hyperlink r:id="rId52">
+      <w:hyperlink r:id="rId53">
         <w:r>
           <w:rPr>
             <w:rStyle w:val="Hyperlink"/>
@@ -7036,7 +6521,7 @@
       <w:r>
         <w:t xml:space="preserve"> </w:t>
       </w:r>
-      <w:hyperlink r:id="rId53">
+      <w:hyperlink r:id="rId54">
         <w:r>
           <w:rPr>
             <w:rStyle w:val="Hyperlink"/>
@@ -7113,7 +6598,7 @@
       <w:r>
         <w:t xml:space="preserve"> </w:t>
       </w:r>
-      <w:hyperlink r:id="rId54">
+      <w:hyperlink r:id="rId55">
         <w:r>
           <w:rPr>
             <w:rStyle w:val="Hyperlink"/>
@@ -7166,7 +6651,7 @@
       <w:r>
         <w:t xml:space="preserve"> </w:t>
       </w:r>
-      <w:hyperlink r:id="rId55">
+      <w:hyperlink r:id="rId56">
         <w:r>
           <w:rPr>
             <w:rStyle w:val="Hyperlink"/>
@@ -7219,7 +6704,7 @@
       <w:r>
         <w:t xml:space="preserve"> </w:t>
       </w:r>
-      <w:hyperlink r:id="rId56">
+      <w:hyperlink r:id="rId57">
         <w:r>
           <w:rPr>
             <w:rStyle w:val="Hyperlink"/>
@@ -7275,6 +6760,38 @@
         <w:pStyle w:val="BodyText"/>
       </w:pPr>
       <w:r>
+        <w:t xml:space="preserve">Le, D. N. (2018). Evaluating impacts of reduction in fluctuation limit on stock price risks in Vietnam.</w:t>
+      </w:r>
+      <w:r>
+        <w:t xml:space="preserve"> </w:t>
+      </w:r>
+      <w:r>
+        <w:rPr>
+          <w:iCs/>
+          <w:i/>
+        </w:rPr>
+        <w:t xml:space="preserve">Journal of Economic Development</w:t>
+      </w:r>
+      <w:r>
+        <w:t xml:space="preserve">.</w:t>
+      </w:r>
+      <w:r>
+        <w:t xml:space="preserve"> </w:t>
+      </w:r>
+      <w:hyperlink r:id="rId58">
+        <w:r>
+          <w:rPr>
+            <w:rStyle w:val="Hyperlink"/>
+          </w:rPr>
+          <w:t xml:space="preserve">https://vjol.info.vn/ed/article/view/34298</w:t>
+        </w:r>
+      </w:hyperlink>
+    </w:p>
+    <w:p>
+      <w:pPr>
+        <w:pStyle w:val="BodyText"/>
+      </w:pPr>
+      <w:r>
         <w:t xml:space="preserve">Liang, H., &amp; Hu, Y. (2025). Stock price limit and its predictability in the Chinese stock market.</w:t>
       </w:r>
       <w:r>
@@ -7293,7 +6810,7 @@
       <w:r>
         <w:t xml:space="preserve"> </w:t>
       </w:r>
-      <w:hyperlink r:id="rId57">
+      <w:hyperlink r:id="rId59">
         <w:r>
           <w:rPr>
             <w:rStyle w:val="Hyperlink"/>
@@ -7346,7 +6863,7 @@
       <w:r>
         <w:t xml:space="preserve"> </w:t>
       </w:r>
-      <w:hyperlink r:id="rId58">
+      <w:hyperlink r:id="rId60">
         <w:r>
           <w:rPr>
             <w:rStyle w:val="Hyperlink"/>
@@ -7378,7 +6895,7 @@
       <w:r>
         <w:t xml:space="preserve"> </w:t>
       </w:r>
-      <w:hyperlink r:id="rId59">
+      <w:hyperlink r:id="rId61">
         <w:r>
           <w:rPr>
             <w:rStyle w:val="Hyperlink"/>
@@ -7431,7 +6948,7 @@
       <w:r>
         <w:t xml:space="preserve"> </w:t>
       </w:r>
-      <w:hyperlink r:id="rId60">
+      <w:hyperlink r:id="rId62">
         <w:r>
           <w:rPr>
             <w:rStyle w:val="Hyperlink"/>
@@ -7484,7 +7001,7 @@
       <w:r>
         <w:t xml:space="preserve"> </w:t>
       </w:r>
-      <w:hyperlink r:id="rId61">
+      <w:hyperlink r:id="rId63">
         <w:r>
           <w:rPr>
             <w:rStyle w:val="Hyperlink"/>
@@ -7576,7 +7093,7 @@
       <w:r>
         <w:t xml:space="preserve"> </w:t>
       </w:r>
-      <w:hyperlink r:id="rId62">
+      <w:hyperlink r:id="rId64">
         <w:r>
           <w:rPr>
             <w:rStyle w:val="Hyperlink"/>
@@ -7608,7 +7125,7 @@
       <w:r>
         <w:t xml:space="preserve"> </w:t>
       </w:r>
-      <w:hyperlink r:id="rId63">
+      <w:hyperlink r:id="rId65">
         <w:r>
           <w:rPr>
             <w:rStyle w:val="Hyperlink"/>
@@ -7643,7 +7160,7 @@
       <w:r>
         <w:t xml:space="preserve"> </w:t>
       </w:r>
-      <w:hyperlink r:id="rId64">
+      <w:hyperlink r:id="rId66">
         <w:r>
           <w:rPr>
             <w:rStyle w:val="Hyperlink"/>
@@ -7673,8 +7190,8 @@
         <w:t xml:space="preserve">, 101778.</w:t>
       </w:r>
     </w:p>
-    <w:bookmarkEnd w:id="65"/>
-    <w:bookmarkStart w:id="66" w:name="figures"/>
+    <w:bookmarkEnd w:id="67"/>
+    <w:bookmarkStart w:id="68" w:name="figures"/>
     <w:p>
       <w:pPr>
         <w:pStyle w:val="Heading1"/>
@@ -7835,8 +7352,8 @@
         <w:t xml:space="preserve">.</w:t>
       </w:r>
     </w:p>
-    <w:bookmarkEnd w:id="66"/>
-    <w:bookmarkStart w:id="67" w:name="tables"/>
+    <w:bookmarkEnd w:id="68"/>
+    <w:bookmarkStart w:id="69" w:name="tables"/>
     <w:p>
       <w:pPr>
         <w:pStyle w:val="Heading1"/>
@@ -13101,10 +12618,10 @@
         <w:t xml:space="preserve"> </w:t>
       </w:r>
       <w:r>
-        <w:t xml:space="preserve">Findings as reported in each source’s abstract or in the records we could access.</w:t>
-      </w:r>
-    </w:p>
-    <w:bookmarkEnd w:id="67"/>
+        <w:t xml:space="preserve">Main published finding of each study, compared with ours by sign, timing, and mechanism.</w:t>
+      </w:r>
+    </w:p>
+    <w:bookmarkEnd w:id="69"/>
     <w:sectPr/>
   </w:body>
 </w:document>
@@ -13211,123 +12728,8 @@
       </w:pPr>
     </w:lvl>
   </w:abstractNum>
-  <w:abstractNum w:abstractNumId="99531">
-    <w:nsid w:val="A99531"/>
-    <w:multiLevelType w:val="multilevel"/>
-    <w:lvl w:ilvl="0">
-      <w:start w:val="1"/>
-      <w:numFmt w:val="lowerRoman"/>
-      <w:lvlText w:val="(%1)"/>
-      <w:lvlJc w:val="left"/>
-      <w:pPr>
-        <w:ind w:left="720" w:hanging="480"/>
-      </w:pPr>
-    </w:lvl>
-    <w:lvl w:ilvl="1">
-      <w:start w:val="1"/>
-      <w:numFmt w:val="lowerRoman"/>
-      <w:lvlText w:val="(%2)"/>
-      <w:lvlJc w:val="left"/>
-      <w:pPr>
-        <w:ind w:left="1440" w:hanging="480"/>
-      </w:pPr>
-    </w:lvl>
-    <w:lvl w:ilvl="2">
-      <w:start w:val="1"/>
-      <w:numFmt w:val="lowerRoman"/>
-      <w:lvlText w:val="(%3)"/>
-      <w:lvlJc w:val="left"/>
-      <w:pPr>
-        <w:ind w:left="2160" w:hanging="480"/>
-      </w:pPr>
-    </w:lvl>
-    <w:lvl w:ilvl="3">
-      <w:start w:val="1"/>
-      <w:numFmt w:val="lowerRoman"/>
-      <w:lvlText w:val="(%4)"/>
-      <w:lvlJc w:val="left"/>
-      <w:pPr>
-        <w:ind w:left="2880" w:hanging="480"/>
-      </w:pPr>
-    </w:lvl>
-    <w:lvl w:ilvl="4">
-      <w:start w:val="1"/>
-      <w:numFmt w:val="lowerRoman"/>
-      <w:lvlText w:val="(%5)"/>
-      <w:lvlJc w:val="left"/>
-      <w:pPr>
-        <w:ind w:left="3600" w:hanging="480"/>
-      </w:pPr>
-    </w:lvl>
-    <w:lvl w:ilvl="5">
-      <w:start w:val="1"/>
-      <w:numFmt w:val="lowerRoman"/>
-      <w:lvlText w:val="(%6)"/>
-      <w:lvlJc w:val="left"/>
-      <w:pPr>
-        <w:ind w:left="4320" w:hanging="480"/>
-      </w:pPr>
-    </w:lvl>
-    <w:lvl w:ilvl="6">
-      <w:start w:val="1"/>
-      <w:numFmt w:val="lowerRoman"/>
-      <w:lvlText w:val="(%7)"/>
-      <w:lvlJc w:val="left"/>
-      <w:pPr>
-        <w:ind w:left="5040" w:hanging="480"/>
-      </w:pPr>
-    </w:lvl>
-    <w:lvl w:ilvl="7">
-      <w:start w:val="1"/>
-      <w:numFmt w:val="lowerRoman"/>
-      <w:lvlText w:val="(%8)"/>
-      <w:lvlJc w:val="left"/>
-      <w:pPr>
-        <w:ind w:left="5760" w:hanging="480"/>
-      </w:pPr>
-    </w:lvl>
-    <w:lvl w:ilvl="8">
-      <w:start w:val="1"/>
-      <w:numFmt w:val="lowerRoman"/>
-      <w:lvlText w:val="(%9)"/>
-      <w:lvlJc w:val="left"/>
-      <w:pPr>
-        <w:ind w:left="6480" w:hanging="480"/>
-      </w:pPr>
-    </w:lvl>
-  </w:abstractNum>
   <w:num w:numId="1000">
     <w:abstractNumId w:val="990"/>
-  </w:num>
-  <w:num w:numId="1001">
-    <w:abstractNumId w:val="99531"/>
-    <w:lvlOverride w:ilvl="0">
-      <w:startOverride w:val="1"/>
-    </w:lvlOverride>
-    <w:lvlOverride w:ilvl="1">
-      <w:startOverride w:val="1"/>
-    </w:lvlOverride>
-    <w:lvlOverride w:ilvl="2">
-      <w:startOverride w:val="1"/>
-    </w:lvlOverride>
-    <w:lvlOverride w:ilvl="3">
-      <w:startOverride w:val="1"/>
-    </w:lvlOverride>
-    <w:lvlOverride w:ilvl="4">
-      <w:startOverride w:val="1"/>
-    </w:lvlOverride>
-    <w:lvlOverride w:ilvl="5">
-      <w:startOverride w:val="1"/>
-    </w:lvlOverride>
-    <w:lvlOverride w:ilvl="6">
-      <w:startOverride w:val="1"/>
-    </w:lvlOverride>
-    <w:lvlOverride w:ilvl="7">
-      <w:startOverride w:val="1"/>
-    </w:lvlOverride>
-    <w:lvlOverride w:ilvl="8">
-      <w:startOverride w:val="1"/>
-    </w:lvlOverride>
   </w:num>
 </w:numbering>
 </file>

</xml_diff>